<commit_message>
Arreglo del modulo de cobranzas, plantillas estables
</commit_message>
<xml_diff>
--- a/backend/routers/plantillas/cobra1.docx
+++ b/backend/routers/plantillas/cobra1.docx
@@ -1,6 +1,6 @@
 
 <file path=word/document.xml><?xml version="1.0" encoding="utf-8"?>
-<w:document xmlns:wpc="http://schemas.microsoft.com/office/word/2010/wordprocessingCanvas" xmlns:cx="http://schemas.microsoft.com/office/drawing/2014/chartex" xmlns:cx1="http://schemas.microsoft.com/office/drawing/2015/9/8/chartex" xmlns:cx2="http://schemas.microsoft.com/office/drawing/2015/10/21/chartex" xmlns:cx3="http://schemas.microsoft.com/office/drawing/2016/5/9/chartex" xmlns:cx4="http://schemas.microsoft.com/office/drawing/2016/5/10/chartex" xmlns:cx5="http://schemas.microsoft.com/office/drawing/2016/5/11/chartex" xmlns:cx6="http://schemas.microsoft.com/office/drawing/2016/5/12/chartex" xmlns:cx7="http://schemas.microsoft.com/office/drawing/2016/5/13/chartex" xmlns:cx8="http://schemas.microsoft.com/office/drawing/2016/5/14/chartex" xmlns:mc="http://schemas.openxmlformats.org/markup-compatibility/2006" xmlns:aink="http://schemas.microsoft.com/office/drawing/2016/ink" xmlns:am3d="http://schemas.microsoft.com/office/drawing/2017/model3d" xmlns:o="urn:schemas-microsoft-com:office:office" xmlns:oel="http://schemas.microsoft.com/office/2019/extlst" xmlns:r="http://schemas.openxmlformats.org/officeDocument/2006/relationships" xmlns:m="http://schemas.openxmlformats.org/officeDocument/2006/math" xmlns:v="urn:schemas-microsoft-com:vml" xmlns:wp14="http://schemas.microsoft.com/office/word/2010/wordprocessingDrawing" xmlns:wp="http://schemas.openxmlformats.org/drawingml/2006/wordprocessingDrawing" xmlns:w10="urn:schemas-microsoft-com:office:word" xmlns:w="http://schemas.openxmlformats.org/wordprocessingml/2006/main" xmlns:w14="http://schemas.microsoft.com/office/word/2010/wordml" xmlns:w15="http://schemas.microsoft.com/office/word/2012/wordml" xmlns:w16cex="http://schemas.microsoft.com/office/word/2018/wordml/cex" xmlns:w16cid="http://schemas.microsoft.com/office/word/2016/wordml/cid" xmlns:w16="http://schemas.microsoft.com/office/word/2018/wordml" xmlns:w16du="http://schemas.microsoft.com/office/word/2023/wordml/word16du" xmlns:w16sdtdh="http://schemas.microsoft.com/office/word/2020/wordml/sdtdatahash" xmlns:w16sdtfl="http://schemas.microsoft.com/office/word/2024/wordml/sdtformatlock" xmlns:w16se="http://schemas.microsoft.com/office/word/2015/wordml/symex" xmlns:wpg="http://schemas.microsoft.com/office/word/2010/wordprocessingGroup" xmlns:wpi="http://schemas.microsoft.com/office/word/2010/wordprocessingInk" xmlns:wne="http://schemas.microsoft.com/office/word/2006/wordml" xmlns:wps="http://schemas.microsoft.com/office/word/2010/wordprocessingShape" mc:Ignorable="w14 w15 w16se w16cid w16 w16cex w16sdtdh w16sdtfl w16du wp14">
+<w:document xmlns:wpc="http://schemas.microsoft.com/office/word/2010/wordprocessingCanvas" xmlns:cx="http://schemas.microsoft.com/office/drawing/2014/chartex" xmlns:cx1="http://schemas.microsoft.com/office/drawing/2015/9/8/chartex" xmlns:cx2="http://schemas.microsoft.com/office/drawing/2015/10/21/chartex" xmlns:cx3="http://schemas.microsoft.com/office/drawing/2016/5/9/chartex" xmlns:cx4="http://schemas.microsoft.com/office/drawing/2016/5/10/chartex" xmlns:cx5="http://schemas.microsoft.com/office/drawing/2016/5/11/chartex" xmlns:cx6="http://schemas.microsoft.com/office/drawing/2016/5/12/chartex" xmlns:cx7="http://schemas.microsoft.com/office/drawing/2016/5/13/chartex" xmlns:cx8="http://schemas.microsoft.com/office/drawing/2016/5/14/chartex" xmlns:mc="http://schemas.openxmlformats.org/markup-compatibility/2006" xmlns:aink="http://schemas.microsoft.com/office/drawing/2016/ink" xmlns:am3d="http://schemas.microsoft.com/office/drawing/2017/model3d" xmlns:o="urn:schemas-microsoft-com:office:office" xmlns:oel="http://schemas.microsoft.com/office/2019/extlst" xmlns:r="http://schemas.openxmlformats.org/officeDocument/2006/relationships" xmlns:m="http://schemas.openxmlformats.org/officeDocument/2006/math" xmlns:v="urn:schemas-microsoft-com:vml" xmlns:wp14="http://schemas.microsoft.com/office/word/2010/wordprocessingDrawing" xmlns:wp="http://schemas.openxmlformats.org/drawingml/2006/wordprocessingDrawing" xmlns:w10="urn:schemas-microsoft-com:office:word" xmlns:w="http://schemas.openxmlformats.org/wordprocessingml/2006/main" xmlns:w14="http://schemas.microsoft.com/office/word/2010/wordml" xmlns:w15="http://schemas.microsoft.com/office/word/2012/wordml" xmlns:w16cei="http://schemas.microsoft.com/office/word/2026/wordml/cei" xmlns:w16cex="http://schemas.microsoft.com/office/word/2018/wordml/cex" xmlns:w16cid="http://schemas.microsoft.com/office/word/2016/wordml/cid" xmlns:w16="http://schemas.microsoft.com/office/word/2018/wordml" xmlns:w16du="http://schemas.microsoft.com/office/word/2023/wordml/word16du" xmlns:w16sdtdh="http://schemas.microsoft.com/office/word/2020/wordml/sdtdatahash" xmlns:w16sdtfl="http://schemas.microsoft.com/office/word/2024/wordml/sdtformatlock" xmlns:w16se="http://schemas.microsoft.com/office/word/2015/wordml/symex" xmlns:wpg="http://schemas.microsoft.com/office/word/2010/wordprocessingGroup" xmlns:wpi="http://schemas.microsoft.com/office/word/2010/wordprocessingInk" xmlns:wne="http://schemas.microsoft.com/office/word/2006/wordml" xmlns:wps="http://schemas.microsoft.com/office/word/2010/wordprocessingShape" mc:Ignorable="w14 w15 w16se w16cid w16 w16cex w16sdtdh w16sdtfl w16du wp14">
   <w:body>
     <w:p>
       <w:pPr>
@@ -515,7 +515,19 @@
         <w:rPr>
           <w:rFonts w:ascii="Arial" w:hAnsi="Arial" w:cs="Arial"/>
         </w:rPr>
-        <w:t xml:space="preserve">Yo, Susel Casimiro Silva, identificada con DNI </w:t>
+        <w:t xml:space="preserve">Yo, </w:t>
+      </w:r>
+      <w:r>
+        <w:rPr>
+          <w:rFonts w:ascii="Arial" w:hAnsi="Arial" w:cs="Arial"/>
+        </w:rPr>
+        <w:t>Fredy Raul Perez De La Torre</w:t>
+      </w:r>
+      <w:r>
+        <w:rPr>
+          <w:rFonts w:ascii="Arial" w:hAnsi="Arial" w:cs="Arial"/>
+        </w:rPr>
+        <w:t xml:space="preserve">, identificada con DNI </w:t>
       </w:r>
       <w:proofErr w:type="spellStart"/>
       <w:r>
@@ -768,16 +780,43 @@
       </w:pPr>
       <w:r>
         <w:rPr>
+          <w:rFonts w:ascii="Arial" w:hAnsi="Arial" w:cs="Arial"/>
+        </w:rPr>
+        <w:t xml:space="preserve">Atentamente; </w:t>
+      </w:r>
+    </w:p>
+    <w:p>
+      <w:pPr>
+        <w:pStyle w:val="Sinespaciado"/>
+      </w:pPr>
+    </w:p>
+    <w:p>
+      <w:pPr>
+        <w:spacing w:after="211"/>
+        <w:ind w:left="91"/>
+        <w:rPr>
+          <w:rFonts w:ascii="Arial" w:eastAsia="Arial" w:hAnsi="Arial" w:cs="Arial"/>
+          <w:bCs/>
+          <w:sz w:val="24"/>
+        </w:rPr>
+      </w:pPr>
+    </w:p>
+    <w:p>
+      <w:pPr>
+        <w:spacing w:after="4687"/>
+      </w:pPr>
+      <w:r>
+        <w:rPr>
           <w:noProof/>
         </w:rPr>
         <w:drawing>
-          <wp:anchor distT="0" distB="0" distL="114300" distR="114300" simplePos="0" relativeHeight="251659264" behindDoc="0" locked="0" layoutInCell="1" allowOverlap="1" wp14:anchorId="072A387D" wp14:editId="79C5D7AB">
+          <wp:anchor distT="0" distB="0" distL="114300" distR="114300" simplePos="0" relativeHeight="251659264" behindDoc="0" locked="0" layoutInCell="1" allowOverlap="1" wp14:anchorId="072A387D" wp14:editId="255FD06B">
             <wp:simplePos x="0" y="0"/>
             <wp:positionH relativeFrom="margin">
               <wp:align>center</wp:align>
             </wp:positionH>
             <wp:positionV relativeFrom="margin">
-              <wp:align>bottom</wp:align>
+              <wp:posOffset>7480878</wp:posOffset>
             </wp:positionV>
             <wp:extent cx="1748367" cy="1214967"/>
             <wp:effectExtent l="0" t="0" r="4445" b="4445"/>
@@ -836,41 +875,16 @@
           </wp:anchor>
         </w:drawing>
       </w:r>
-      <w:r>
-        <w:rPr>
-          <w:rFonts w:ascii="Arial" w:hAnsi="Arial" w:cs="Arial"/>
-        </w:rPr>
-        <w:t xml:space="preserve">Atentamente; </w:t>
-      </w:r>
-    </w:p>
-    <w:p>
-      <w:pPr>
-        <w:pStyle w:val="Sinespaciado"/>
-      </w:pPr>
-    </w:p>
-    <w:p>
-      <w:pPr>
-        <w:spacing w:after="211"/>
-        <w:ind w:left="91"/>
-        <w:rPr>
-          <w:rFonts w:ascii="Arial" w:eastAsia="Arial" w:hAnsi="Arial" w:cs="Arial"/>
-          <w:bCs/>
-          <w:sz w:val="24"/>
-        </w:rPr>
-      </w:pPr>
-    </w:p>
-    <w:p>
-      <w:pPr>
-        <w:spacing w:after="4687"/>
-      </w:pPr>
     </w:p>
     <w:sectPr>
       <w:headerReference w:type="even" r:id="rId10"/>
       <w:headerReference w:type="default" r:id="rId11"/>
-      <w:footerReference w:type="default" r:id="rId12"/>
-      <w:headerReference w:type="first" r:id="rId13"/>
+      <w:footerReference w:type="even" r:id="rId12"/>
+      <w:footerReference w:type="default" r:id="rId13"/>
+      <w:headerReference w:type="first" r:id="rId14"/>
+      <w:footerReference w:type="first" r:id="rId15"/>
       <w:pgSz w:w="11906" w:h="16838"/>
-      <w:pgMar w:top="1417" w:right="1701" w:bottom="1417" w:left="1701" w:header="720" w:footer="720" w:gutter="0"/>
+      <w:pgMar w:top="720" w:right="720" w:bottom="720" w:left="720" w:header="720" w:footer="720" w:gutter="0"/>
       <w:cols w:space="720"/>
       <w:docGrid w:linePitch="299"/>
     </w:sectPr>
@@ -879,7 +893,7 @@
 </file>
 
 <file path=word/endnotes.xml><?xml version="1.0" encoding="utf-8"?>
-<w:endnotes xmlns:wpc="http://schemas.microsoft.com/office/word/2010/wordprocessingCanvas" xmlns:cx="http://schemas.microsoft.com/office/drawing/2014/chartex" xmlns:cx1="http://schemas.microsoft.com/office/drawing/2015/9/8/chartex" xmlns:cx2="http://schemas.microsoft.com/office/drawing/2015/10/21/chartex" xmlns:cx3="http://schemas.microsoft.com/office/drawing/2016/5/9/chartex" xmlns:cx4="http://schemas.microsoft.com/office/drawing/2016/5/10/chartex" xmlns:cx5="http://schemas.microsoft.com/office/drawing/2016/5/11/chartex" xmlns:cx6="http://schemas.microsoft.com/office/drawing/2016/5/12/chartex" xmlns:cx7="http://schemas.microsoft.com/office/drawing/2016/5/13/chartex" xmlns:cx8="http://schemas.microsoft.com/office/drawing/2016/5/14/chartex" xmlns:mc="http://schemas.openxmlformats.org/markup-compatibility/2006" xmlns:aink="http://schemas.microsoft.com/office/drawing/2016/ink" xmlns:am3d="http://schemas.microsoft.com/office/drawing/2017/model3d" xmlns:o="urn:schemas-microsoft-com:office:office" xmlns:oel="http://schemas.microsoft.com/office/2019/extlst" xmlns:r="http://schemas.openxmlformats.org/officeDocument/2006/relationships" xmlns:m="http://schemas.openxmlformats.org/officeDocument/2006/math" xmlns:v="urn:schemas-microsoft-com:vml" xmlns:wp14="http://schemas.microsoft.com/office/word/2010/wordprocessingDrawing" xmlns:wp="http://schemas.openxmlformats.org/drawingml/2006/wordprocessingDrawing" xmlns:w10="urn:schemas-microsoft-com:office:word" xmlns:w="http://schemas.openxmlformats.org/wordprocessingml/2006/main" xmlns:w14="http://schemas.microsoft.com/office/word/2010/wordml" xmlns:w15="http://schemas.microsoft.com/office/word/2012/wordml" xmlns:w16cex="http://schemas.microsoft.com/office/word/2018/wordml/cex" xmlns:w16cid="http://schemas.microsoft.com/office/word/2016/wordml/cid" xmlns:w16="http://schemas.microsoft.com/office/word/2018/wordml" xmlns:w16du="http://schemas.microsoft.com/office/word/2023/wordml/word16du" xmlns:w16sdtdh="http://schemas.microsoft.com/office/word/2020/wordml/sdtdatahash" xmlns:w16sdtfl="http://schemas.microsoft.com/office/word/2024/wordml/sdtformatlock" xmlns:w16se="http://schemas.microsoft.com/office/word/2015/wordml/symex" xmlns:wpg="http://schemas.microsoft.com/office/word/2010/wordprocessingGroup" xmlns:wpi="http://schemas.microsoft.com/office/word/2010/wordprocessingInk" xmlns:wne="http://schemas.microsoft.com/office/word/2006/wordml" xmlns:wps="http://schemas.microsoft.com/office/word/2010/wordprocessingShape" mc:Ignorable="w14 w15 w16se w16cid w16 w16cex w16sdtdh w16sdtfl w16du wp14">
+<w:endnotes xmlns:wpc="http://schemas.microsoft.com/office/word/2010/wordprocessingCanvas" xmlns:cx="http://schemas.microsoft.com/office/drawing/2014/chartex" xmlns:cx1="http://schemas.microsoft.com/office/drawing/2015/9/8/chartex" xmlns:cx2="http://schemas.microsoft.com/office/drawing/2015/10/21/chartex" xmlns:cx3="http://schemas.microsoft.com/office/drawing/2016/5/9/chartex" xmlns:cx4="http://schemas.microsoft.com/office/drawing/2016/5/10/chartex" xmlns:cx5="http://schemas.microsoft.com/office/drawing/2016/5/11/chartex" xmlns:cx6="http://schemas.microsoft.com/office/drawing/2016/5/12/chartex" xmlns:cx7="http://schemas.microsoft.com/office/drawing/2016/5/13/chartex" xmlns:cx8="http://schemas.microsoft.com/office/drawing/2016/5/14/chartex" xmlns:mc="http://schemas.openxmlformats.org/markup-compatibility/2006" xmlns:aink="http://schemas.microsoft.com/office/drawing/2016/ink" xmlns:am3d="http://schemas.microsoft.com/office/drawing/2017/model3d" xmlns:o="urn:schemas-microsoft-com:office:office" xmlns:oel="http://schemas.microsoft.com/office/2019/extlst" xmlns:r="http://schemas.openxmlformats.org/officeDocument/2006/relationships" xmlns:m="http://schemas.openxmlformats.org/officeDocument/2006/math" xmlns:v="urn:schemas-microsoft-com:vml" xmlns:wp14="http://schemas.microsoft.com/office/word/2010/wordprocessingDrawing" xmlns:wp="http://schemas.openxmlformats.org/drawingml/2006/wordprocessingDrawing" xmlns:w10="urn:schemas-microsoft-com:office:word" xmlns:w="http://schemas.openxmlformats.org/wordprocessingml/2006/main" xmlns:w14="http://schemas.microsoft.com/office/word/2010/wordml" xmlns:w15="http://schemas.microsoft.com/office/word/2012/wordml" xmlns:w16cei="http://schemas.microsoft.com/office/word/2026/wordml/cei" xmlns:w16cex="http://schemas.microsoft.com/office/word/2018/wordml/cex" xmlns:w16cid="http://schemas.microsoft.com/office/word/2016/wordml/cid" xmlns:w16="http://schemas.microsoft.com/office/word/2018/wordml" xmlns:w16du="http://schemas.microsoft.com/office/word/2023/wordml/word16du" xmlns:w16sdtdh="http://schemas.microsoft.com/office/word/2020/wordml/sdtdatahash" xmlns:w16sdtfl="http://schemas.microsoft.com/office/word/2024/wordml/sdtformatlock" xmlns:w16se="http://schemas.microsoft.com/office/word/2015/wordml/symex" xmlns:wpg="http://schemas.microsoft.com/office/word/2010/wordprocessingGroup" xmlns:wpi="http://schemas.microsoft.com/office/word/2010/wordprocessingInk" xmlns:wne="http://schemas.microsoft.com/office/word/2006/wordml" xmlns:wps="http://schemas.microsoft.com/office/word/2010/wordprocessingShape" mc:Ignorable="w14 w15 w16se w16cid w16 w16cex w16sdtdh w16sdtfl w16du wp14">
   <w:endnote w:type="separator" w:id="-1">
     <w:p>
       <w:pPr>
@@ -904,28 +918,39 @@
 </file>
 
 <file path=word/footer1.xml><?xml version="1.0" encoding="utf-8"?>
-<w:ftr xmlns:wpc="http://schemas.microsoft.com/office/word/2010/wordprocessingCanvas" xmlns:cx="http://schemas.microsoft.com/office/drawing/2014/chartex" xmlns:cx1="http://schemas.microsoft.com/office/drawing/2015/9/8/chartex" xmlns:cx2="http://schemas.microsoft.com/office/drawing/2015/10/21/chartex" xmlns:cx3="http://schemas.microsoft.com/office/drawing/2016/5/9/chartex" xmlns:cx4="http://schemas.microsoft.com/office/drawing/2016/5/10/chartex" xmlns:cx5="http://schemas.microsoft.com/office/drawing/2016/5/11/chartex" xmlns:cx6="http://schemas.microsoft.com/office/drawing/2016/5/12/chartex" xmlns:cx7="http://schemas.microsoft.com/office/drawing/2016/5/13/chartex" xmlns:cx8="http://schemas.microsoft.com/office/drawing/2016/5/14/chartex" xmlns:mc="http://schemas.openxmlformats.org/markup-compatibility/2006" xmlns:aink="http://schemas.microsoft.com/office/drawing/2016/ink" xmlns:am3d="http://schemas.microsoft.com/office/drawing/2017/model3d" xmlns:o="urn:schemas-microsoft-com:office:office" xmlns:oel="http://schemas.microsoft.com/office/2019/extlst" xmlns:r="http://schemas.openxmlformats.org/officeDocument/2006/relationships" xmlns:m="http://schemas.openxmlformats.org/officeDocument/2006/math" xmlns:v="urn:schemas-microsoft-com:vml" xmlns:wp14="http://schemas.microsoft.com/office/word/2010/wordprocessingDrawing" xmlns:wp="http://schemas.openxmlformats.org/drawingml/2006/wordprocessingDrawing" xmlns:w10="urn:schemas-microsoft-com:office:word" xmlns:w="http://schemas.openxmlformats.org/wordprocessingml/2006/main" xmlns:w14="http://schemas.microsoft.com/office/word/2010/wordml" xmlns:w15="http://schemas.microsoft.com/office/word/2012/wordml" xmlns:w16cex="http://schemas.microsoft.com/office/word/2018/wordml/cex" xmlns:w16cid="http://schemas.microsoft.com/office/word/2016/wordml/cid" xmlns:w16="http://schemas.microsoft.com/office/word/2018/wordml" xmlns:w16du="http://schemas.microsoft.com/office/word/2023/wordml/word16du" xmlns:w16sdtdh="http://schemas.microsoft.com/office/word/2020/wordml/sdtdatahash" xmlns:w16sdtfl="http://schemas.microsoft.com/office/word/2024/wordml/sdtformatlock" xmlns:w16se="http://schemas.microsoft.com/office/word/2015/wordml/symex" xmlns:wpg="http://schemas.microsoft.com/office/word/2010/wordprocessingGroup" xmlns:wpi="http://schemas.microsoft.com/office/word/2010/wordprocessingInk" xmlns:wne="http://schemas.microsoft.com/office/word/2006/wordml" xmlns:wps="http://schemas.microsoft.com/office/word/2010/wordprocessingShape" mc:Ignorable="w14 w15 w16se w16cid w16 w16cex w16sdtdh w16sdtfl w16du wp14">
+<w:ftr xmlns:wpc="http://schemas.microsoft.com/office/word/2010/wordprocessingCanvas" xmlns:cx="http://schemas.microsoft.com/office/drawing/2014/chartex" xmlns:cx1="http://schemas.microsoft.com/office/drawing/2015/9/8/chartex" xmlns:cx2="http://schemas.microsoft.com/office/drawing/2015/10/21/chartex" xmlns:cx3="http://schemas.microsoft.com/office/drawing/2016/5/9/chartex" xmlns:cx4="http://schemas.microsoft.com/office/drawing/2016/5/10/chartex" xmlns:cx5="http://schemas.microsoft.com/office/drawing/2016/5/11/chartex" xmlns:cx6="http://schemas.microsoft.com/office/drawing/2016/5/12/chartex" xmlns:cx7="http://schemas.microsoft.com/office/drawing/2016/5/13/chartex" xmlns:cx8="http://schemas.microsoft.com/office/drawing/2016/5/14/chartex" xmlns:mc="http://schemas.openxmlformats.org/markup-compatibility/2006" xmlns:aink="http://schemas.microsoft.com/office/drawing/2016/ink" xmlns:am3d="http://schemas.microsoft.com/office/drawing/2017/model3d" xmlns:o="urn:schemas-microsoft-com:office:office" xmlns:oel="http://schemas.microsoft.com/office/2019/extlst" xmlns:r="http://schemas.openxmlformats.org/officeDocument/2006/relationships" xmlns:m="http://schemas.openxmlformats.org/officeDocument/2006/math" xmlns:v="urn:schemas-microsoft-com:vml" xmlns:wp14="http://schemas.microsoft.com/office/word/2010/wordprocessingDrawing" xmlns:wp="http://schemas.openxmlformats.org/drawingml/2006/wordprocessingDrawing" xmlns:w10="urn:schemas-microsoft-com:office:word" xmlns:w="http://schemas.openxmlformats.org/wordprocessingml/2006/main" xmlns:w14="http://schemas.microsoft.com/office/word/2010/wordml" xmlns:w15="http://schemas.microsoft.com/office/word/2012/wordml" xmlns:w16cei="http://schemas.microsoft.com/office/word/2026/wordml/cei" xmlns:w16cex="http://schemas.microsoft.com/office/word/2018/wordml/cex" xmlns:w16cid="http://schemas.microsoft.com/office/word/2016/wordml/cid" xmlns:w16="http://schemas.microsoft.com/office/word/2018/wordml" xmlns:w16du="http://schemas.microsoft.com/office/word/2023/wordml/word16du" xmlns:w16sdtdh="http://schemas.microsoft.com/office/word/2020/wordml/sdtdatahash" xmlns:w16sdtfl="http://schemas.microsoft.com/office/word/2024/wordml/sdtformatlock" xmlns:w16se="http://schemas.microsoft.com/office/word/2015/wordml/symex" xmlns:wpg="http://schemas.microsoft.com/office/word/2010/wordprocessingGroup" xmlns:wpi="http://schemas.microsoft.com/office/word/2010/wordprocessingInk" xmlns:wne="http://schemas.microsoft.com/office/word/2006/wordml" xmlns:wps="http://schemas.microsoft.com/office/word/2010/wordprocessingShape" mc:Ignorable="w14 w15 w16se w16cid w16 w16cex w16sdtdh w16sdtfl w16du wp14">
+  <w:p>
+    <w:pPr>
+      <w:pStyle w:val="Piedepgina"/>
+    </w:pPr>
+  </w:p>
+</w:ftr>
+</file>
+
+<file path=word/footer2.xml><?xml version="1.0" encoding="utf-8"?>
+<w:ftr xmlns:wpc="http://schemas.microsoft.com/office/word/2010/wordprocessingCanvas" xmlns:cx="http://schemas.microsoft.com/office/drawing/2014/chartex" xmlns:cx1="http://schemas.microsoft.com/office/drawing/2015/9/8/chartex" xmlns:cx2="http://schemas.microsoft.com/office/drawing/2015/10/21/chartex" xmlns:cx3="http://schemas.microsoft.com/office/drawing/2016/5/9/chartex" xmlns:cx4="http://schemas.microsoft.com/office/drawing/2016/5/10/chartex" xmlns:cx5="http://schemas.microsoft.com/office/drawing/2016/5/11/chartex" xmlns:cx6="http://schemas.microsoft.com/office/drawing/2016/5/12/chartex" xmlns:cx7="http://schemas.microsoft.com/office/drawing/2016/5/13/chartex" xmlns:cx8="http://schemas.microsoft.com/office/drawing/2016/5/14/chartex" xmlns:mc="http://schemas.openxmlformats.org/markup-compatibility/2006" xmlns:aink="http://schemas.microsoft.com/office/drawing/2016/ink" xmlns:am3d="http://schemas.microsoft.com/office/drawing/2017/model3d" xmlns:o="urn:schemas-microsoft-com:office:office" xmlns:oel="http://schemas.microsoft.com/office/2019/extlst" xmlns:r="http://schemas.openxmlformats.org/officeDocument/2006/relationships" xmlns:m="http://schemas.openxmlformats.org/officeDocument/2006/math" xmlns:v="urn:schemas-microsoft-com:vml" xmlns:wp14="http://schemas.microsoft.com/office/word/2010/wordprocessingDrawing" xmlns:wp="http://schemas.openxmlformats.org/drawingml/2006/wordprocessingDrawing" xmlns:w10="urn:schemas-microsoft-com:office:word" xmlns:w="http://schemas.openxmlformats.org/wordprocessingml/2006/main" xmlns:w14="http://schemas.microsoft.com/office/word/2010/wordml" xmlns:w15="http://schemas.microsoft.com/office/word/2012/wordml" xmlns:w16cei="http://schemas.microsoft.com/office/word/2026/wordml/cei" xmlns:w16cex="http://schemas.microsoft.com/office/word/2018/wordml/cex" xmlns:w16cid="http://schemas.microsoft.com/office/word/2016/wordml/cid" xmlns:w16="http://schemas.microsoft.com/office/word/2018/wordml" xmlns:w16du="http://schemas.microsoft.com/office/word/2023/wordml/word16du" xmlns:w16sdtdh="http://schemas.microsoft.com/office/word/2020/wordml/sdtdatahash" xmlns:w16sdtfl="http://schemas.microsoft.com/office/word/2024/wordml/sdtformatlock" xmlns:w16se="http://schemas.microsoft.com/office/word/2015/wordml/symex" xmlns:wpg="http://schemas.microsoft.com/office/word/2010/wordprocessingGroup" xmlns:wpi="http://schemas.microsoft.com/office/word/2010/wordprocessingInk" xmlns:wne="http://schemas.microsoft.com/office/word/2006/wordml" xmlns:wps="http://schemas.microsoft.com/office/word/2010/wordprocessingShape" mc:Ignorable="w14 w15 w16se w16cid w16 w16cex w16sdtdh w16sdtfl w16du wp14">
   <w:p>
     <w:pPr>
       <w:pStyle w:val="Piedepgina"/>
     </w:pPr>
     <w:r>
       <w:rPr>
+        <w:rFonts w:ascii="Arial" w:hAnsi="Arial" w:cs="Arial"/>
         <w:noProof/>
       </w:rPr>
       <mc:AlternateContent>
         <mc:Choice Requires="wpg">
           <w:drawing>
-            <wp:anchor distT="0" distB="0" distL="114300" distR="114300" simplePos="0" relativeHeight="251684864" behindDoc="0" locked="0" layoutInCell="1" allowOverlap="1" wp14:anchorId="6F74866F" wp14:editId="6A1E6CD6">
+            <wp:anchor distT="0" distB="0" distL="114300" distR="114300" simplePos="0" relativeHeight="251684864" behindDoc="0" locked="0" layoutInCell="1" allowOverlap="1" wp14:anchorId="6F74866F" wp14:editId="1B083219">
               <wp:simplePos x="0" y="0"/>
               <wp:positionH relativeFrom="margin">
-                <wp:posOffset>460293</wp:posOffset>
+                <wp:posOffset>267077</wp:posOffset>
               </wp:positionH>
               <wp:positionV relativeFrom="paragraph">
-                <wp:posOffset>-200660</wp:posOffset>
+                <wp:posOffset>-141517</wp:posOffset>
               </wp:positionV>
-              <wp:extent cx="4611119" cy="755069"/>
-              <wp:effectExtent l="0" t="0" r="18415" b="26035"/>
+              <wp:extent cx="6508668" cy="751437"/>
+              <wp:effectExtent l="0" t="0" r="26035" b="0"/>
               <wp:wrapNone/>
               <wp:docPr id="613892707" name="Grupo 6"/>
               <wp:cNvGraphicFramePr/>
@@ -936,9 +961,9 @@
                     <wpg:grpSpPr>
                       <a:xfrm>
                         <a:off x="0" y="0"/>
-                        <a:ext cx="4611119" cy="755069"/>
-                        <a:chOff x="1319808" y="-16842"/>
-                        <a:chExt cx="4923932" cy="755069"/>
+                        <a:ext cx="6508668" cy="751437"/>
+                        <a:chOff x="1319808" y="-12509"/>
+                        <a:chExt cx="4919851" cy="719311"/>
                       </a:xfrm>
                     </wpg:grpSpPr>
                     <pic:pic xmlns:pic="http://schemas.openxmlformats.org/drawingml/2006/picture">
@@ -963,7 +988,7 @@
                       </pic:blipFill>
                       <pic:spPr bwMode="auto">
                         <a:xfrm>
-                          <a:off x="1319808" y="39934"/>
+                          <a:off x="1319808" y="39902"/>
                           <a:ext cx="1331047" cy="666900"/>
                         </a:xfrm>
                         <a:prstGeom prst="rect">
@@ -985,10 +1010,10 @@
                       <wpg:cNvGrpSpPr/>
                       <wpg:grpSpPr>
                         <a:xfrm>
-                          <a:off x="2659685" y="-16842"/>
-                          <a:ext cx="3584055" cy="755069"/>
-                          <a:chOff x="1700018" y="-16842"/>
-                          <a:chExt cx="3584055" cy="755069"/>
+                          <a:off x="2671960" y="-12509"/>
+                          <a:ext cx="3567699" cy="700781"/>
+                          <a:chOff x="1712293" y="-12509"/>
+                          <a:chExt cx="3567699" cy="700781"/>
                         </a:xfrm>
                       </wpg:grpSpPr>
                       <wpg:grpSp>
@@ -996,10 +1021,10 @@
                         <wpg:cNvGrpSpPr/>
                         <wpg:grpSpPr>
                           <a:xfrm>
-                            <a:off x="1700018" y="-16842"/>
-                            <a:ext cx="3584055" cy="755069"/>
-                            <a:chOff x="1566465" y="-16849"/>
-                            <a:chExt cx="3302495" cy="755387"/>
+                            <a:off x="1713245" y="-12509"/>
+                            <a:ext cx="3566747" cy="700781"/>
+                            <a:chOff x="1578651" y="-12514"/>
+                            <a:chExt cx="3286549" cy="701075"/>
                           </a:xfrm>
                         </wpg:grpSpPr>
                         <wpg:grpSp>
@@ -1007,10 +1032,10 @@
                           <wpg:cNvGrpSpPr/>
                           <wpg:grpSpPr>
                             <a:xfrm>
-                              <a:off x="1566465" y="78005"/>
-                              <a:ext cx="1054117" cy="660533"/>
-                              <a:chOff x="1498611" y="70859"/>
-                              <a:chExt cx="1008457" cy="573134"/>
+                              <a:off x="1578651" y="116553"/>
+                              <a:ext cx="1555679" cy="572008"/>
+                              <a:chOff x="1510270" y="104306"/>
+                              <a:chExt cx="1488294" cy="496325"/>
                             </a:xfrm>
                           </wpg:grpSpPr>
                           <wps:wsp>
@@ -1020,8 +1045,8 @@
                             </wps:cNvSpPr>
                             <wps:spPr bwMode="auto">
                               <a:xfrm>
-                                <a:off x="1498611" y="70859"/>
-                                <a:ext cx="1008457" cy="573134"/>
+                                <a:off x="1510270" y="174059"/>
+                                <a:ext cx="1453318" cy="426572"/>
                               </a:xfrm>
                               <a:prstGeom prst="rect">
                                 <a:avLst/>
@@ -1043,8 +1068,14 @@
                                 <w:p>
                                   <w:pPr>
                                     <w:pStyle w:val="Sinespaciado"/>
+                                    <w:rPr>
+                                      <w:rFonts w:ascii="Arial" w:hAnsi="Arial" w:cs="Arial"/>
+                                    </w:rPr>
                                   </w:pPr>
                                   <w:r>
+                                    <w:rPr>
+                                      <w:rFonts w:ascii="Arial" w:hAnsi="Arial" w:cs="Arial"/>
+                                    </w:rPr>
                                     <w:pict w14:anchorId="6F850E0E">
                                       <v:shapetype id="_x0000_t75" coordsize="21600,21600" o:spt="75" o:preferrelative="t" path="m@4@5l@4@11@9@11@9@5xe" filled="f" stroked="f">
                                         <v:stroke joinstyle="miter"/>
@@ -1065,34 +1096,24 @@
                                         <v:path o:extrusionok="f" gradientshapeok="t" o:connecttype="rect"/>
                                         <o:lock v:ext="edit" aspectratio="t"/>
                                       </v:shapetype>
-                                      <v:shape id="Gráfico 3" o:spid="_x0000_i1029" type="#_x0000_t75" alt="Auricular con relleno sólido" style="width:10.65pt;height:9.4pt;visibility:visible" o:gfxdata="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">
+                                      <v:shape id="Gráfico 3" o:spid="_x0000_i1029" type="#_x0000_t75" alt="Auricular con relleno sólido" style="width:10.7pt;height:9.25pt;visibility:visible" o:gfxdata="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">
                                         <v:imagedata r:id="rId2" o:title="" cropbottom="-1024f" cropright="-311f"/>
                                       </v:shape>
                                     </w:pict>
                                   </w:r>
                                   <w:r>
-                                    <w:t xml:space="preserve"> 905 462 </w:t>
+                                    <w:rPr>
+                                      <w:rFonts w:ascii="Arial" w:hAnsi="Arial" w:cs="Arial"/>
+                                    </w:rPr>
+                                    <w:t xml:space="preserve"> 905 462 670  </w:t>
                                   </w:r>
                                   <w:r>
-                                    <w:t>6</w:t>
-                                  </w:r>
-                                  <w:r>
-                                    <w:t xml:space="preserve">70  </w:t>
-                                  </w:r>
-                                  <w:r>
-                                    <w:t xml:space="preserve">     </w:t>
-                                  </w:r>
-                                </w:p>
-                                <w:p>
-                                  <w:pPr>
-                                    <w:pStyle w:val="Sinespaciado"/>
-                                  </w:pPr>
-                                  <w:r>
                                     <w:rPr>
+                                      <w:rFonts w:ascii="Arial" w:hAnsi="Arial" w:cs="Arial"/>
                                       <w:noProof/>
                                     </w:rPr>
                                     <w:drawing>
-                                      <wp:inline distT="0" distB="0" distL="0" distR="0" wp14:anchorId="7AE2768C" wp14:editId="5CEAC9A0">
+                                      <wp:inline distT="0" distB="0" distL="0" distR="0" wp14:anchorId="44A4C3D2" wp14:editId="7FF92980">
                                         <wp:extent cx="135236" cy="123825"/>
                                         <wp:effectExtent l="0" t="0" r="0" b="0"/>
                                         <wp:docPr id="489322327" name="Gráfico 3" descr="Auricular con relleno sólido"/>
@@ -1134,27 +1155,34 @@
                                     </w:drawing>
                                   </w:r>
                                   <w:r>
-                                    <w:t xml:space="preserve"> </w:t>
-                                  </w:r>
-                                  <w:r>
-                                    <w:t>957 210 673</w:t>
-                                  </w:r>
-                                  <w:r>
-                                    <w:t xml:space="preserve">       </w:t>
-                                  </w:r>
-                                  <w:r>
-                                    <w:t xml:space="preserve">       </w:t>
-                                  </w:r>
-                                  <w:r>
-                                    <w:t xml:space="preserve">   </w:t>
+                                    <w:rPr>
+                                      <w:rFonts w:ascii="Arial" w:hAnsi="Arial" w:cs="Arial"/>
+                                    </w:rPr>
+                                    <w:t xml:space="preserve"> 957 210 673                 </w:t>
                                   </w:r>
                                 </w:p>
                                 <w:p>
                                   <w:pPr>
                                     <w:pStyle w:val="Sinespaciado"/>
+                                    <w:rPr>
+                                      <w:rFonts w:ascii="Arial" w:hAnsi="Arial" w:cs="Arial"/>
+                                    </w:rPr>
                                   </w:pPr>
                                   <w:r>
                                     <w:rPr>
+                                      <w:rFonts w:ascii="Arial" w:hAnsi="Arial" w:cs="Arial"/>
+                                    </w:rPr>
+                                    <w:t xml:space="preserve"> </w:t>
+                                  </w:r>
+                                  <w:r>
+                                    <w:rPr>
+                                      <w:rFonts w:ascii="Arial" w:hAnsi="Arial" w:cs="Arial"/>
+                                    </w:rPr>
+                                    <w:t xml:space="preserve">                </w:t>
+                                  </w:r>
+                                  <w:r>
+                                    <w:rPr>
+                                      <w:rFonts w:ascii="Arial" w:hAnsi="Arial" w:cs="Arial"/>
                                       <w:noProof/>
                                     </w:rPr>
                                     <w:drawing>
@@ -1200,22 +1228,10 @@
                                     </w:drawing>
                                   </w:r>
                                   <w:r>
-                                    <w:t xml:space="preserve"> </w:t>
-                                  </w:r>
-                                  <w:r>
-                                    <w:t>908 898 440</w:t>
-                                  </w:r>
-                                  <w:r>
-                                    <w:t xml:space="preserve">       </w:t>
-                                  </w:r>
-                                  <w:r>
-                                    <w:t xml:space="preserve">     </w:t>
-                                  </w:r>
-                                  <w:r>
-                                    <w:t xml:space="preserve"> </w:t>
-                                  </w:r>
-                                  <w:r>
-                                    <w:t xml:space="preserve">  </w:t>
+                                    <w:rPr>
+                                      <w:rFonts w:ascii="Arial" w:hAnsi="Arial" w:cs="Arial"/>
+                                    </w:rPr>
+                                    <w:t xml:space="preserve"> 908 898 440               </w:t>
                                   </w:r>
                                 </w:p>
                                 <w:p>
@@ -1248,7 +1264,7 @@
                             <wps:cNvCnPr/>
                             <wps:spPr>
                               <a:xfrm>
-                                <a:off x="2445145" y="100262"/>
+                                <a:off x="2998564" y="104306"/>
                                 <a:ext cx="0" cy="456118"/>
                               </a:xfrm>
                               <a:prstGeom prst="line">
@@ -1284,8 +1300,8 @@
                           </wps:cNvSpPr>
                           <wps:spPr bwMode="auto">
                             <a:xfrm>
-                              <a:off x="2581472" y="-16849"/>
-                              <a:ext cx="2287488" cy="658770"/>
+                              <a:off x="3137940" y="-12514"/>
+                              <a:ext cx="1727260" cy="658770"/>
                             </a:xfrm>
                             <a:prstGeom prst="rect">
                               <a:avLst/>
@@ -1307,12 +1323,19 @@
                               <w:p>
                                 <w:pPr>
                                   <w:pStyle w:val="Sinespaciado"/>
+                                  <w:rPr>
+                                    <w:rFonts w:ascii="Arial" w:hAnsi="Arial" w:cs="Arial"/>
+                                  </w:rPr>
                                 </w:pPr>
                                 <w:r>
+                                  <w:rPr>
+                                    <w:rFonts w:ascii="Arial" w:hAnsi="Arial" w:cs="Arial"/>
+                                  </w:rPr>
                                   <w:t xml:space="preserve">Ecolimp  </w:t>
                                 </w:r>
                                 <w:r>
                                   <w:rPr>
+                                    <w:rFonts w:ascii="Arial" w:hAnsi="Arial" w:cs="Arial"/>
                                     <w:noProof/>
                                   </w:rPr>
                                   <w:drawing>
@@ -1367,11 +1390,15 @@
                                   </w:drawing>
                                 </w:r>
                                 <w:r>
+                                  <w:rPr>
+                                    <w:rFonts w:ascii="Arial" w:hAnsi="Arial" w:cs="Arial"/>
+                                  </w:rPr>
                                   <w:t xml:space="preserve"> </w:t>
                                 </w:r>
                                 <w:r>
                                   <w:rPr>
                                     <w:rStyle w:val="Hipervnculo"/>
+                                    <w:rFonts w:ascii="Arial" w:hAnsi="Arial" w:cs="Arial"/>
                                     <w:noProof/>
                                     <w:color w:val="000000"/>
                                     <w:u w:val="none"/>
@@ -1435,50 +1462,61 @@
                                   </w:drawing>
                                 </w:r>
                                 <w:r>
-                                  <w:t xml:space="preserve">                   </w:t>
-                                </w:r>
-                                <w:r>
-                                  <w:t xml:space="preserve">             </w:t>
+                                  <w:rPr>
+                                    <w:rFonts w:ascii="Arial" w:hAnsi="Arial" w:cs="Arial"/>
+                                  </w:rPr>
+                                  <w:t xml:space="preserve">                                </w:t>
                                 </w:r>
                               </w:p>
                               <w:p>
                                 <w:pPr>
                                   <w:pStyle w:val="Sinespaciado"/>
+                                  <w:rPr>
+                                    <w:rFonts w:ascii="Arial" w:hAnsi="Arial" w:cs="Arial"/>
+                                  </w:rPr>
                                 </w:pPr>
                                 <w:hyperlink r:id="rId9" w:history="1">
                                   <w:r>
                                     <w:rPr>
                                       <w:rStyle w:val="Hipervnculo"/>
+                                      <w:rFonts w:ascii="Arial" w:hAnsi="Arial" w:cs="Arial"/>
                                     </w:rPr>
                                     <w:t>ecolimp.comprasperu@outlook.com</w:t>
                                   </w:r>
                                 </w:hyperlink>
                                 <w:r>
+                                  <w:rPr>
+                                    <w:rFonts w:ascii="Arial" w:hAnsi="Arial" w:cs="Arial"/>
+                                  </w:rPr>
                                   <w:t xml:space="preserve"> </w:t>
                                 </w:r>
                               </w:p>
                               <w:p>
                                 <w:pPr>
                                   <w:pStyle w:val="Sinespaciado"/>
+                                  <w:rPr>
+                                    <w:rFonts w:ascii="Arial" w:hAnsi="Arial" w:cs="Arial"/>
+                                  </w:rPr>
                                 </w:pPr>
                                 <w:hyperlink r:id="rId10" w:history="1">
                                   <w:r>
                                     <w:rPr>
                                       <w:rStyle w:val="Hipervnculo"/>
+                                      <w:rFonts w:ascii="Arial" w:hAnsi="Arial" w:cs="Arial"/>
                                     </w:rPr>
                                     <w:t>www.ecolimp.gruecolimp.com</w:t>
                                   </w:r>
                                 </w:hyperlink>
                                 <w:r>
-                                  <w:t xml:space="preserve">     </w:t>
+                                  <w:rPr>
+                                    <w:rFonts w:ascii="Arial" w:hAnsi="Arial" w:cs="Arial"/>
+                                  </w:rPr>
+                                  <w:t xml:space="preserve">        </w:t>
                                 </w:r>
                                 <w:r>
-                                  <w:t xml:space="preserve"> </w:t>
-                                </w:r>
-                                <w:r>
-                                  <w:t xml:space="preserve">  </w:t>
-                                </w:r>
-                                <w:r>
+                                  <w:rPr>
+                                    <w:rFonts w:ascii="Arial" w:hAnsi="Arial" w:cs="Arial"/>
+                                  </w:rPr>
                                   <w:t xml:space="preserve">   </w:t>
                                 </w:r>
                               </w:p>
@@ -1556,54 +1594,50 @@
         </mc:Choice>
         <mc:Fallback>
           <w:pict>
-            <v:group w14:anchorId="6F74866F" id="Grupo 6" o:spid="_x0000_s1031" style="position:absolute;margin-left:36.25pt;margin-top:-15.8pt;width:363.1pt;height:59.45pt;z-index:251684864;mso-position-horizontal-relative:margin;mso-width-relative:margin;mso-height-relative:margin" coordorigin="13198,-168" coordsize="49239,7550" o:gfxdata="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">
+            <v:group w14:anchorId="6F74866F" id="Grupo 6" o:spid="_x0000_s1031" style="position:absolute;margin-left:21.05pt;margin-top:-11.15pt;width:512.5pt;height:59.15pt;z-index:251684864;mso-position-horizontal-relative:margin;mso-width-relative:margin;mso-height-relative:margin" coordorigin="13198,-125" coordsize="49198,7193" o:gfxdata="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">
               <v:shape id="Imagen 7" o:spid="_x0000_s1032" type="#_x0000_t75" style="position:absolute;left:13198;top:399;width:13310;height:6669;visibility:visible;mso-wrap-style:square" o:gfxdata="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">
                 <v:imagedata r:id="rId11" o:title="" croptop="16955f" cropbottom="21659f" cropleft="9930f" cropright="8789f"/>
               </v:shape>
-              <v:group id="Grupo 7" o:spid="_x0000_s1033" style="position:absolute;left:26596;top:-168;width:35841;height:7550" coordorigin="17000,-168" coordsize="35840,7550" o:gfxdata="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">
-                <v:group id="_x0000_s1034" style="position:absolute;left:17000;top:-168;width:35840;height:7550" coordorigin="15664,-168" coordsize="33024,7553" o:gfxdata="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">
-                  <v:group id="Grupo 10" o:spid="_x0000_s1035" style="position:absolute;left:15664;top:780;width:10541;height:6605" coordorigin="14986,708" coordsize="10084,5731" o:gfxdata="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">
+              <v:group id="Grupo 7" o:spid="_x0000_s1033" style="position:absolute;left:26719;top:-125;width:35677;height:7007" coordorigin="17122,-125" coordsize="35676,7007" o:gfxdata="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">
+                <v:group id="_x0000_s1034" style="position:absolute;left:17132;top:-125;width:35667;height:7007" coordorigin="15786,-125" coordsize="32865,7010" o:gfxdata="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">
+                  <v:group id="Grupo 10" o:spid="_x0000_s1035" style="position:absolute;left:15786;top:1165;width:15557;height:5720" coordorigin="15102,1043" coordsize="14882,4963" o:gfxdata="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">
                     <v:shapetype id="_x0000_t202" coordsize="21600,21600" o:spt="202" path="m,l,21600r21600,l21600,xe">
                       <v:stroke joinstyle="miter"/>
                       <v:path gradientshapeok="t" o:connecttype="rect"/>
                     </v:shapetype>
-                    <v:shape id="Cuadro de texto 2" o:spid="_x0000_s1036" type="#_x0000_t202" style="position:absolute;left:14986;top:708;width:10084;height:5731;visibility:visible;mso-wrap-style:square;v-text-anchor:top" o:gfxdata="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" strokecolor="white [3212]">
+                    <v:shape id="Cuadro de texto 2" o:spid="_x0000_s1036" type="#_x0000_t202" style="position:absolute;left:15102;top:1740;width:14533;height:4266;visibility:visible;mso-wrap-style:square;v-text-anchor:top" o:gfxdata="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" strokecolor="white [3212]">
                       <v:textbox>
                         <w:txbxContent>
                           <w:p>
                             <w:pPr>
                               <w:pStyle w:val="Sinespaciado"/>
+                              <w:rPr>
+                                <w:rFonts w:ascii="Arial" w:hAnsi="Arial" w:cs="Arial"/>
+                              </w:rPr>
                             </w:pPr>
                             <w:r>
+                              <w:rPr>
+                                <w:rFonts w:ascii="Arial" w:hAnsi="Arial" w:cs="Arial"/>
+                              </w:rPr>
                               <w:pict w14:anchorId="6F850E0E">
-                                <v:shape id="Gráfico 3" o:spid="_x0000_i1029" type="#_x0000_t75" alt="Auricular con relleno sólido" style="width:10.65pt;height:9.4pt;visibility:visible" o:gfxdata="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">
-                                  <v:imagedata r:id="rId12" o:title="" cropbottom="-1024f" cropright="-311f"/>
+                                <v:shape id="Gráfico 3" o:spid="_x0000_i1029" type="#_x0000_t75" alt="Auricular con relleno sólido" style="width:10.7pt;height:9.25pt;visibility:visible" o:gfxdata="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">
+                                  <v:imagedata r:id="rId2" o:title="" cropbottom="-1024f" cropright="-311f"/>
                                 </v:shape>
                               </w:pict>
                             </w:r>
                             <w:r>
-                              <w:t xml:space="preserve"> 905 462 </w:t>
+                              <w:rPr>
+                                <w:rFonts w:ascii="Arial" w:hAnsi="Arial" w:cs="Arial"/>
+                              </w:rPr>
+                              <w:t xml:space="preserve"> 905 462 670  </w:t>
                             </w:r>
                             <w:r>
-                              <w:t>6</w:t>
-                            </w:r>
-                            <w:r>
-                              <w:t xml:space="preserve">70  </w:t>
-                            </w:r>
-                            <w:r>
-                              <w:t xml:space="preserve">     </w:t>
-                            </w:r>
-                          </w:p>
-                          <w:p>
-                            <w:pPr>
-                              <w:pStyle w:val="Sinespaciado"/>
-                            </w:pPr>
-                            <w:r>
                               <w:rPr>
+                                <w:rFonts w:ascii="Arial" w:hAnsi="Arial" w:cs="Arial"/>
                                 <w:noProof/>
                               </w:rPr>
                               <w:drawing>
-                                <wp:inline distT="0" distB="0" distL="0" distR="0" wp14:anchorId="7AE2768C" wp14:editId="5CEAC9A0">
+                                <wp:inline distT="0" distB="0" distL="0" distR="0" wp14:anchorId="44A4C3D2" wp14:editId="7FF92980">
                                   <wp:extent cx="135236" cy="123825"/>
                                   <wp:effectExtent l="0" t="0" r="0" b="0"/>
                                   <wp:docPr id="489322327" name="Gráfico 3" descr="Auricular con relleno sólido"/>
@@ -1618,10 +1652,10 @@
                                           <pic:cNvPicPr/>
                                         </pic:nvPicPr>
                                         <pic:blipFill>
-                                          <a:blip r:embed="rId13">
+                                          <a:blip r:embed="rId3">
                                             <a:extLst>
                                               <a:ext uri="{96DAC541-7B7A-43D3-8B79-37D633B846F1}">
-                                                <asvg:svgBlip xmlns:asvg="http://schemas.microsoft.com/office/drawing/2016/SVG/main" r:embed="rId14"/>
+                                                <asvg:svgBlip xmlns:asvg="http://schemas.microsoft.com/office/drawing/2016/SVG/main" r:embed="rId4"/>
                                               </a:ext>
                                             </a:extLst>
                                           </a:blip>
@@ -1645,27 +1679,34 @@
                               </w:drawing>
                             </w:r>
                             <w:r>
-                              <w:t xml:space="preserve"> </w:t>
-                            </w:r>
-                            <w:r>
-                              <w:t>957 210 673</w:t>
-                            </w:r>
-                            <w:r>
-                              <w:t xml:space="preserve">       </w:t>
-                            </w:r>
-                            <w:r>
-                              <w:t xml:space="preserve">       </w:t>
-                            </w:r>
-                            <w:r>
-                              <w:t xml:space="preserve">   </w:t>
+                              <w:rPr>
+                                <w:rFonts w:ascii="Arial" w:hAnsi="Arial" w:cs="Arial"/>
+                              </w:rPr>
+                              <w:t xml:space="preserve"> 957 210 673                 </w:t>
                             </w:r>
                           </w:p>
                           <w:p>
                             <w:pPr>
                               <w:pStyle w:val="Sinespaciado"/>
+                              <w:rPr>
+                                <w:rFonts w:ascii="Arial" w:hAnsi="Arial" w:cs="Arial"/>
+                              </w:rPr>
                             </w:pPr>
                             <w:r>
                               <w:rPr>
+                                <w:rFonts w:ascii="Arial" w:hAnsi="Arial" w:cs="Arial"/>
+                              </w:rPr>
+                              <w:t xml:space="preserve"> </w:t>
+                            </w:r>
+                            <w:r>
+                              <w:rPr>
+                                <w:rFonts w:ascii="Arial" w:hAnsi="Arial" w:cs="Arial"/>
+                              </w:rPr>
+                              <w:t xml:space="preserve">                </w:t>
+                            </w:r>
+                            <w:r>
+                              <w:rPr>
+                                <w:rFonts w:ascii="Arial" w:hAnsi="Arial" w:cs="Arial"/>
                                 <w:noProof/>
                               </w:rPr>
                               <w:drawing>
@@ -1684,10 +1725,10 @@
                                           <pic:cNvPicPr/>
                                         </pic:nvPicPr>
                                         <pic:blipFill>
-                                          <a:blip r:embed="rId13">
+                                          <a:blip r:embed="rId3">
                                             <a:extLst>
                                               <a:ext uri="{96DAC541-7B7A-43D3-8B79-37D633B846F1}">
-                                                <asvg:svgBlip xmlns:asvg="http://schemas.microsoft.com/office/drawing/2016/SVG/main" r:embed="rId14"/>
+                                                <asvg:svgBlip xmlns:asvg="http://schemas.microsoft.com/office/drawing/2016/SVG/main" r:embed="rId4"/>
                                               </a:ext>
                                             </a:extLst>
                                           </a:blip>
@@ -1711,22 +1752,10 @@
                               </w:drawing>
                             </w:r>
                             <w:r>
-                              <w:t xml:space="preserve"> </w:t>
-                            </w:r>
-                            <w:r>
-                              <w:t>908 898 440</w:t>
-                            </w:r>
-                            <w:r>
-                              <w:t xml:space="preserve">       </w:t>
-                            </w:r>
-                            <w:r>
-                              <w:t xml:space="preserve">     </w:t>
-                            </w:r>
-                            <w:r>
-                              <w:t xml:space="preserve"> </w:t>
-                            </w:r>
-                            <w:r>
-                              <w:t xml:space="preserve">  </w:t>
+                              <w:rPr>
+                                <w:rFonts w:ascii="Arial" w:hAnsi="Arial" w:cs="Arial"/>
+                              </w:rPr>
+                              <w:t xml:space="preserve"> 908 898 440               </w:t>
                             </w:r>
                           </w:p>
                           <w:p>
@@ -1751,22 +1780,29 @@
                         </w:txbxContent>
                       </v:textbox>
                     </v:shape>
-                    <v:line id="Conector recto 1" o:spid="_x0000_s1037" style="position:absolute;visibility:visible;mso-wrap-style:square" from="24451,1002" to="24451,5563" o:connectortype="straight" o:gfxdata="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" strokecolor="black [3213]" strokeweight="1pt">
+                    <v:line id="Conector recto 1" o:spid="_x0000_s1037" style="position:absolute;visibility:visible;mso-wrap-style:square" from="29985,1043" to="29985,5604" o:connectortype="straight" o:gfxdata="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" strokecolor="black [3213]" strokeweight="1pt">
                       <v:stroke joinstyle="miter"/>
                     </v:line>
                   </v:group>
-                  <v:shape id="Cuadro de texto 2" o:spid="_x0000_s1038" type="#_x0000_t202" style="position:absolute;left:25814;top:-168;width:22875;height:6587;visibility:visible;mso-wrap-style:square;v-text-anchor:top" o:gfxdata="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" strokecolor="white [3212]">
+                  <v:shape id="Cuadro de texto 2" o:spid="_x0000_s1038" type="#_x0000_t202" style="position:absolute;left:31379;top:-125;width:17273;height:6587;visibility:visible;mso-wrap-style:square;v-text-anchor:top" o:gfxdata="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" strokecolor="white [3212]">
                     <v:textbox>
                       <w:txbxContent>
                         <w:p>
                           <w:pPr>
                             <w:pStyle w:val="Sinespaciado"/>
+                            <w:rPr>
+                              <w:rFonts w:ascii="Arial" w:hAnsi="Arial" w:cs="Arial"/>
+                            </w:rPr>
                           </w:pPr>
                           <w:r>
+                            <w:rPr>
+                              <w:rFonts w:ascii="Arial" w:hAnsi="Arial" w:cs="Arial"/>
+                            </w:rPr>
                             <w:t xml:space="preserve">Ecolimp  </w:t>
                           </w:r>
                           <w:r>
                             <w:rPr>
+                              <w:rFonts w:ascii="Arial" w:hAnsi="Arial" w:cs="Arial"/>
                               <w:noProof/>
                             </w:rPr>
                             <w:drawing>
@@ -1774,7 +1810,7 @@
                                 <wp:extent cx="137160" cy="137160"/>
                                 <wp:effectExtent l="0" t="0" r="0" b="0"/>
                                 <wp:docPr id="297324956" name="Imagen 9" descr="Tiktok logo - Icono gratis PNG, SVG">
-                                  <a:hlinkClick xmlns:a="http://schemas.openxmlformats.org/drawingml/2006/main" r:id="rId15"/>
+                                  <a:hlinkClick xmlns:a="http://schemas.openxmlformats.org/drawingml/2006/main" r:id="rId5"/>
                                 </wp:docPr>
                                 <wp:cNvGraphicFramePr>
                                   <a:graphicFrameLocks xmlns:a="http://schemas.openxmlformats.org/drawingml/2006/main" noChangeAspect="1"/>
@@ -1789,7 +1825,7 @@
                                         </pic:cNvPicPr>
                                       </pic:nvPicPr>
                                       <pic:blipFill>
-                                        <a:blip r:embed="rId16">
+                                        <a:blip r:embed="rId6">
                                           <a:extLst>
                                             <a:ext uri="{28A0092B-C50C-407E-A947-70E740481C1C}">
                                               <a14:useLocalDpi xmlns:a14="http://schemas.microsoft.com/office/drawing/2010/main" val="0"/>
@@ -1821,11 +1857,15 @@
                             </w:drawing>
                           </w:r>
                           <w:r>
+                            <w:rPr>
+                              <w:rFonts w:ascii="Arial" w:hAnsi="Arial" w:cs="Arial"/>
+                            </w:rPr>
                             <w:t xml:space="preserve"> </w:t>
                           </w:r>
                           <w:r>
                             <w:rPr>
                               <w:rStyle w:val="Hipervnculo"/>
+                              <w:rFonts w:ascii="Arial" w:hAnsi="Arial" w:cs="Arial"/>
                               <w:noProof/>
                               <w:color w:val="000000"/>
                               <w:u w:val="none"/>
@@ -1835,7 +1875,7 @@
                                 <wp:extent cx="172169" cy="187960"/>
                                 <wp:effectExtent l="0" t="0" r="0" b="2540"/>
                                 <wp:docPr id="274922293" name="Imagen 4" descr="Iconos De Facebook PNG para descargar gratis">
-                                  <a:hlinkClick xmlns:a="http://schemas.openxmlformats.org/drawingml/2006/main" r:id="rId17"/>
+                                  <a:hlinkClick xmlns:a="http://schemas.openxmlformats.org/drawingml/2006/main" r:id="rId7"/>
                                 </wp:docPr>
                                 <wp:cNvGraphicFramePr>
                                   <a:graphicFrameLocks xmlns:a="http://schemas.openxmlformats.org/drawingml/2006/main" noChangeAspect="1"/>
@@ -1845,14 +1885,14 @@
                                     <pic:pic xmlns:pic="http://schemas.openxmlformats.org/drawingml/2006/picture">
                                       <pic:nvPicPr>
                                         <pic:cNvPr id="405001739" name="Imagen 4" descr="Iconos De Facebook PNG para descargar gratis">
-                                          <a:hlinkClick r:id="rId17"/>
+                                          <a:hlinkClick r:id="rId7"/>
                                         </pic:cNvPr>
                                         <pic:cNvPicPr>
                                           <a:picLocks noChangeAspect="1" noChangeArrowheads="1"/>
                                         </pic:cNvPicPr>
                                       </pic:nvPicPr>
                                       <pic:blipFill rotWithShape="1">
-                                        <a:blip r:embed="rId18">
+                                        <a:blip r:embed="rId8">
                                           <a:extLst>
                                             <a:ext uri="{28A0092B-C50C-407E-A947-70E740481C1C}">
                                               <a14:useLocalDpi xmlns:a14="http://schemas.microsoft.com/office/drawing/2010/main" val="0"/>
@@ -1889,50 +1929,61 @@
                             </w:drawing>
                           </w:r>
                           <w:r>
-                            <w:t xml:space="preserve">                   </w:t>
-                          </w:r>
-                          <w:r>
-                            <w:t xml:space="preserve">             </w:t>
+                            <w:rPr>
+                              <w:rFonts w:ascii="Arial" w:hAnsi="Arial" w:cs="Arial"/>
+                            </w:rPr>
+                            <w:t xml:space="preserve">                                </w:t>
                           </w:r>
                         </w:p>
                         <w:p>
                           <w:pPr>
                             <w:pStyle w:val="Sinespaciado"/>
+                            <w:rPr>
+                              <w:rFonts w:ascii="Arial" w:hAnsi="Arial" w:cs="Arial"/>
+                            </w:rPr>
                           </w:pPr>
-                          <w:hyperlink r:id="rId19" w:history="1">
+                          <w:hyperlink r:id="rId12" w:history="1">
                             <w:r>
                               <w:rPr>
                                 <w:rStyle w:val="Hipervnculo"/>
+                                <w:rFonts w:ascii="Arial" w:hAnsi="Arial" w:cs="Arial"/>
                               </w:rPr>
                               <w:t>ecolimp.comprasperu@outlook.com</w:t>
                             </w:r>
                           </w:hyperlink>
                           <w:r>
+                            <w:rPr>
+                              <w:rFonts w:ascii="Arial" w:hAnsi="Arial" w:cs="Arial"/>
+                            </w:rPr>
                             <w:t xml:space="preserve"> </w:t>
                           </w:r>
                         </w:p>
                         <w:p>
                           <w:pPr>
                             <w:pStyle w:val="Sinespaciado"/>
+                            <w:rPr>
+                              <w:rFonts w:ascii="Arial" w:hAnsi="Arial" w:cs="Arial"/>
+                            </w:rPr>
                           </w:pPr>
-                          <w:hyperlink r:id="rId20" w:history="1">
+                          <w:hyperlink r:id="rId13" w:history="1">
                             <w:r>
                               <w:rPr>
                                 <w:rStyle w:val="Hipervnculo"/>
+                                <w:rFonts w:ascii="Arial" w:hAnsi="Arial" w:cs="Arial"/>
                               </w:rPr>
                               <w:t>www.ecolimp.gruecolimp.com</w:t>
                             </w:r>
                           </w:hyperlink>
                           <w:r>
-                            <w:t xml:space="preserve">     </w:t>
+                            <w:rPr>
+                              <w:rFonts w:ascii="Arial" w:hAnsi="Arial" w:cs="Arial"/>
+                            </w:rPr>
+                            <w:t xml:space="preserve">        </w:t>
                           </w:r>
                           <w:r>
-                            <w:t xml:space="preserve"> </w:t>
-                          </w:r>
-                          <w:r>
-                            <w:t xml:space="preserve">  </w:t>
-                          </w:r>
-                          <w:r>
+                            <w:rPr>
+                              <w:rFonts w:ascii="Arial" w:hAnsi="Arial" w:cs="Arial"/>
+                            </w:rPr>
                             <w:t xml:space="preserve">   </w:t>
                           </w:r>
                         </w:p>
@@ -1973,8 +2024,18 @@
 </w:ftr>
 </file>
 
+<file path=word/footer3.xml><?xml version="1.0" encoding="utf-8"?>
+<w:ftr xmlns:wpc="http://schemas.microsoft.com/office/word/2010/wordprocessingCanvas" xmlns:cx="http://schemas.microsoft.com/office/drawing/2014/chartex" xmlns:cx1="http://schemas.microsoft.com/office/drawing/2015/9/8/chartex" xmlns:cx2="http://schemas.microsoft.com/office/drawing/2015/10/21/chartex" xmlns:cx3="http://schemas.microsoft.com/office/drawing/2016/5/9/chartex" xmlns:cx4="http://schemas.microsoft.com/office/drawing/2016/5/10/chartex" xmlns:cx5="http://schemas.microsoft.com/office/drawing/2016/5/11/chartex" xmlns:cx6="http://schemas.microsoft.com/office/drawing/2016/5/12/chartex" xmlns:cx7="http://schemas.microsoft.com/office/drawing/2016/5/13/chartex" xmlns:cx8="http://schemas.microsoft.com/office/drawing/2016/5/14/chartex" xmlns:mc="http://schemas.openxmlformats.org/markup-compatibility/2006" xmlns:aink="http://schemas.microsoft.com/office/drawing/2016/ink" xmlns:am3d="http://schemas.microsoft.com/office/drawing/2017/model3d" xmlns:o="urn:schemas-microsoft-com:office:office" xmlns:oel="http://schemas.microsoft.com/office/2019/extlst" xmlns:r="http://schemas.openxmlformats.org/officeDocument/2006/relationships" xmlns:m="http://schemas.openxmlformats.org/officeDocument/2006/math" xmlns:v="urn:schemas-microsoft-com:vml" xmlns:wp14="http://schemas.microsoft.com/office/word/2010/wordprocessingDrawing" xmlns:wp="http://schemas.openxmlformats.org/drawingml/2006/wordprocessingDrawing" xmlns:w10="urn:schemas-microsoft-com:office:word" xmlns:w="http://schemas.openxmlformats.org/wordprocessingml/2006/main" xmlns:w14="http://schemas.microsoft.com/office/word/2010/wordml" xmlns:w15="http://schemas.microsoft.com/office/word/2012/wordml" xmlns:w16cei="http://schemas.microsoft.com/office/word/2026/wordml/cei" xmlns:w16cex="http://schemas.microsoft.com/office/word/2018/wordml/cex" xmlns:w16cid="http://schemas.microsoft.com/office/word/2016/wordml/cid" xmlns:w16="http://schemas.microsoft.com/office/word/2018/wordml" xmlns:w16du="http://schemas.microsoft.com/office/word/2023/wordml/word16du" xmlns:w16sdtdh="http://schemas.microsoft.com/office/word/2020/wordml/sdtdatahash" xmlns:w16sdtfl="http://schemas.microsoft.com/office/word/2024/wordml/sdtformatlock" xmlns:w16se="http://schemas.microsoft.com/office/word/2015/wordml/symex" xmlns:wpg="http://schemas.microsoft.com/office/word/2010/wordprocessingGroup" xmlns:wpi="http://schemas.microsoft.com/office/word/2010/wordprocessingInk" xmlns:wne="http://schemas.microsoft.com/office/word/2006/wordml" xmlns:wps="http://schemas.microsoft.com/office/word/2010/wordprocessingShape" mc:Ignorable="w14 w15 w16se w16cid w16 w16cex w16sdtdh w16sdtfl w16du wp14">
+  <w:p>
+    <w:pPr>
+      <w:pStyle w:val="Piedepgina"/>
+    </w:pPr>
+  </w:p>
+</w:ftr>
+</file>
+
 <file path=word/footnotes.xml><?xml version="1.0" encoding="utf-8"?>
-<w:footnotes xmlns:wpc="http://schemas.microsoft.com/office/word/2010/wordprocessingCanvas" xmlns:cx="http://schemas.microsoft.com/office/drawing/2014/chartex" xmlns:cx1="http://schemas.microsoft.com/office/drawing/2015/9/8/chartex" xmlns:cx2="http://schemas.microsoft.com/office/drawing/2015/10/21/chartex" xmlns:cx3="http://schemas.microsoft.com/office/drawing/2016/5/9/chartex" xmlns:cx4="http://schemas.microsoft.com/office/drawing/2016/5/10/chartex" xmlns:cx5="http://schemas.microsoft.com/office/drawing/2016/5/11/chartex" xmlns:cx6="http://schemas.microsoft.com/office/drawing/2016/5/12/chartex" xmlns:cx7="http://schemas.microsoft.com/office/drawing/2016/5/13/chartex" xmlns:cx8="http://schemas.microsoft.com/office/drawing/2016/5/14/chartex" xmlns:mc="http://schemas.openxmlformats.org/markup-compatibility/2006" xmlns:aink="http://schemas.microsoft.com/office/drawing/2016/ink" xmlns:am3d="http://schemas.microsoft.com/office/drawing/2017/model3d" xmlns:o="urn:schemas-microsoft-com:office:office" xmlns:oel="http://schemas.microsoft.com/office/2019/extlst" xmlns:r="http://schemas.openxmlformats.org/officeDocument/2006/relationships" xmlns:m="http://schemas.openxmlformats.org/officeDocument/2006/math" xmlns:v="urn:schemas-microsoft-com:vml" xmlns:wp14="http://schemas.microsoft.com/office/word/2010/wordprocessingDrawing" xmlns:wp="http://schemas.openxmlformats.org/drawingml/2006/wordprocessingDrawing" xmlns:w10="urn:schemas-microsoft-com:office:word" xmlns:w="http://schemas.openxmlformats.org/wordprocessingml/2006/main" xmlns:w14="http://schemas.microsoft.com/office/word/2010/wordml" xmlns:w15="http://schemas.microsoft.com/office/word/2012/wordml" xmlns:w16cex="http://schemas.microsoft.com/office/word/2018/wordml/cex" xmlns:w16cid="http://schemas.microsoft.com/office/word/2016/wordml/cid" xmlns:w16="http://schemas.microsoft.com/office/word/2018/wordml" xmlns:w16du="http://schemas.microsoft.com/office/word/2023/wordml/word16du" xmlns:w16sdtdh="http://schemas.microsoft.com/office/word/2020/wordml/sdtdatahash" xmlns:w16sdtfl="http://schemas.microsoft.com/office/word/2024/wordml/sdtformatlock" xmlns:w16se="http://schemas.microsoft.com/office/word/2015/wordml/symex" xmlns:wpg="http://schemas.microsoft.com/office/word/2010/wordprocessingGroup" xmlns:wpi="http://schemas.microsoft.com/office/word/2010/wordprocessingInk" xmlns:wne="http://schemas.microsoft.com/office/word/2006/wordml" xmlns:wps="http://schemas.microsoft.com/office/word/2010/wordprocessingShape" mc:Ignorable="w14 w15 w16se w16cid w16 w16cex w16sdtdh w16sdtfl w16du wp14">
+<w:footnotes xmlns:wpc="http://schemas.microsoft.com/office/word/2010/wordprocessingCanvas" xmlns:cx="http://schemas.microsoft.com/office/drawing/2014/chartex" xmlns:cx1="http://schemas.microsoft.com/office/drawing/2015/9/8/chartex" xmlns:cx2="http://schemas.microsoft.com/office/drawing/2015/10/21/chartex" xmlns:cx3="http://schemas.microsoft.com/office/drawing/2016/5/9/chartex" xmlns:cx4="http://schemas.microsoft.com/office/drawing/2016/5/10/chartex" xmlns:cx5="http://schemas.microsoft.com/office/drawing/2016/5/11/chartex" xmlns:cx6="http://schemas.microsoft.com/office/drawing/2016/5/12/chartex" xmlns:cx7="http://schemas.microsoft.com/office/drawing/2016/5/13/chartex" xmlns:cx8="http://schemas.microsoft.com/office/drawing/2016/5/14/chartex" xmlns:mc="http://schemas.openxmlformats.org/markup-compatibility/2006" xmlns:aink="http://schemas.microsoft.com/office/drawing/2016/ink" xmlns:am3d="http://schemas.microsoft.com/office/drawing/2017/model3d" xmlns:o="urn:schemas-microsoft-com:office:office" xmlns:oel="http://schemas.microsoft.com/office/2019/extlst" xmlns:r="http://schemas.openxmlformats.org/officeDocument/2006/relationships" xmlns:m="http://schemas.openxmlformats.org/officeDocument/2006/math" xmlns:v="urn:schemas-microsoft-com:vml" xmlns:wp14="http://schemas.microsoft.com/office/word/2010/wordprocessingDrawing" xmlns:wp="http://schemas.openxmlformats.org/drawingml/2006/wordprocessingDrawing" xmlns:w10="urn:schemas-microsoft-com:office:word" xmlns:w="http://schemas.openxmlformats.org/wordprocessingml/2006/main" xmlns:w14="http://schemas.microsoft.com/office/word/2010/wordml" xmlns:w15="http://schemas.microsoft.com/office/word/2012/wordml" xmlns:w16cei="http://schemas.microsoft.com/office/word/2026/wordml/cei" xmlns:w16cex="http://schemas.microsoft.com/office/word/2018/wordml/cex" xmlns:w16cid="http://schemas.microsoft.com/office/word/2016/wordml/cid" xmlns:w16="http://schemas.microsoft.com/office/word/2018/wordml" xmlns:w16du="http://schemas.microsoft.com/office/word/2023/wordml/word16du" xmlns:w16sdtdh="http://schemas.microsoft.com/office/word/2020/wordml/sdtdatahash" xmlns:w16sdtfl="http://schemas.microsoft.com/office/word/2024/wordml/sdtformatlock" xmlns:w16se="http://schemas.microsoft.com/office/word/2015/wordml/symex" xmlns:wpg="http://schemas.microsoft.com/office/word/2010/wordprocessingGroup" xmlns:wpi="http://schemas.microsoft.com/office/word/2010/wordprocessingInk" xmlns:wne="http://schemas.microsoft.com/office/word/2006/wordml" xmlns:wps="http://schemas.microsoft.com/office/word/2010/wordprocessingShape" mc:Ignorable="w14 w15 w16se w16cid w16 w16cex w16sdtdh w16sdtfl w16du wp14">
   <w:footnote w:type="separator" w:id="-1">
     <w:p>
       <w:pPr>
@@ -1999,7 +2060,7 @@
 </file>
 
 <file path=word/header1.xml><?xml version="1.0" encoding="utf-8"?>
-<w:hdr xmlns:wpc="http://schemas.microsoft.com/office/word/2010/wordprocessingCanvas" xmlns:cx="http://schemas.microsoft.com/office/drawing/2014/chartex" xmlns:cx1="http://schemas.microsoft.com/office/drawing/2015/9/8/chartex" xmlns:cx2="http://schemas.microsoft.com/office/drawing/2015/10/21/chartex" xmlns:cx3="http://schemas.microsoft.com/office/drawing/2016/5/9/chartex" xmlns:cx4="http://schemas.microsoft.com/office/drawing/2016/5/10/chartex" xmlns:cx5="http://schemas.microsoft.com/office/drawing/2016/5/11/chartex" xmlns:cx6="http://schemas.microsoft.com/office/drawing/2016/5/12/chartex" xmlns:cx7="http://schemas.microsoft.com/office/drawing/2016/5/13/chartex" xmlns:cx8="http://schemas.microsoft.com/office/drawing/2016/5/14/chartex" xmlns:mc="http://schemas.openxmlformats.org/markup-compatibility/2006" xmlns:aink="http://schemas.microsoft.com/office/drawing/2016/ink" xmlns:am3d="http://schemas.microsoft.com/office/drawing/2017/model3d" xmlns:o="urn:schemas-microsoft-com:office:office" xmlns:oel="http://schemas.microsoft.com/office/2019/extlst" xmlns:r="http://schemas.openxmlformats.org/officeDocument/2006/relationships" xmlns:m="http://schemas.openxmlformats.org/officeDocument/2006/math" xmlns:v="urn:schemas-microsoft-com:vml" xmlns:wp14="http://schemas.microsoft.com/office/word/2010/wordprocessingDrawing" xmlns:wp="http://schemas.openxmlformats.org/drawingml/2006/wordprocessingDrawing" xmlns:w10="urn:schemas-microsoft-com:office:word" xmlns:w="http://schemas.openxmlformats.org/wordprocessingml/2006/main" xmlns:w14="http://schemas.microsoft.com/office/word/2010/wordml" xmlns:w15="http://schemas.microsoft.com/office/word/2012/wordml" xmlns:w16cex="http://schemas.microsoft.com/office/word/2018/wordml/cex" xmlns:w16cid="http://schemas.microsoft.com/office/word/2016/wordml/cid" xmlns:w16="http://schemas.microsoft.com/office/word/2018/wordml" xmlns:w16du="http://schemas.microsoft.com/office/word/2023/wordml/word16du" xmlns:w16sdtdh="http://schemas.microsoft.com/office/word/2020/wordml/sdtdatahash" xmlns:w16sdtfl="http://schemas.microsoft.com/office/word/2024/wordml/sdtformatlock" xmlns:w16se="http://schemas.microsoft.com/office/word/2015/wordml/symex" xmlns:wpg="http://schemas.microsoft.com/office/word/2010/wordprocessingGroup" xmlns:wpi="http://schemas.microsoft.com/office/word/2010/wordprocessingInk" xmlns:wne="http://schemas.microsoft.com/office/word/2006/wordml" xmlns:wps="http://schemas.microsoft.com/office/word/2010/wordprocessingShape" mc:Ignorable="w14 w15 w16se w16cid w16 w16cex w16sdtdh w16sdtfl w16du wp14">
+<w:hdr xmlns:wpc="http://schemas.microsoft.com/office/word/2010/wordprocessingCanvas" xmlns:cx="http://schemas.microsoft.com/office/drawing/2014/chartex" xmlns:cx1="http://schemas.microsoft.com/office/drawing/2015/9/8/chartex" xmlns:cx2="http://schemas.microsoft.com/office/drawing/2015/10/21/chartex" xmlns:cx3="http://schemas.microsoft.com/office/drawing/2016/5/9/chartex" xmlns:cx4="http://schemas.microsoft.com/office/drawing/2016/5/10/chartex" xmlns:cx5="http://schemas.microsoft.com/office/drawing/2016/5/11/chartex" xmlns:cx6="http://schemas.microsoft.com/office/drawing/2016/5/12/chartex" xmlns:cx7="http://schemas.microsoft.com/office/drawing/2016/5/13/chartex" xmlns:cx8="http://schemas.microsoft.com/office/drawing/2016/5/14/chartex" xmlns:mc="http://schemas.openxmlformats.org/markup-compatibility/2006" xmlns:aink="http://schemas.microsoft.com/office/drawing/2016/ink" xmlns:am3d="http://schemas.microsoft.com/office/drawing/2017/model3d" xmlns:o="urn:schemas-microsoft-com:office:office" xmlns:oel="http://schemas.microsoft.com/office/2019/extlst" xmlns:r="http://schemas.openxmlformats.org/officeDocument/2006/relationships" xmlns:m="http://schemas.openxmlformats.org/officeDocument/2006/math" xmlns:v="urn:schemas-microsoft-com:vml" xmlns:wp14="http://schemas.microsoft.com/office/word/2010/wordprocessingDrawing" xmlns:wp="http://schemas.openxmlformats.org/drawingml/2006/wordprocessingDrawing" xmlns:w10="urn:schemas-microsoft-com:office:word" xmlns:w="http://schemas.openxmlformats.org/wordprocessingml/2006/main" xmlns:w14="http://schemas.microsoft.com/office/word/2010/wordml" xmlns:w15="http://schemas.microsoft.com/office/word/2012/wordml" xmlns:w16cei="http://schemas.microsoft.com/office/word/2026/wordml/cei" xmlns:w16cex="http://schemas.microsoft.com/office/word/2018/wordml/cex" xmlns:w16cid="http://schemas.microsoft.com/office/word/2016/wordml/cid" xmlns:w16="http://schemas.microsoft.com/office/word/2018/wordml" xmlns:w16du="http://schemas.microsoft.com/office/word/2023/wordml/word16du" xmlns:w16sdtdh="http://schemas.microsoft.com/office/word/2020/wordml/sdtdatahash" xmlns:w16sdtfl="http://schemas.microsoft.com/office/word/2024/wordml/sdtformatlock" xmlns:w16se="http://schemas.microsoft.com/office/word/2015/wordml/symex" xmlns:wpg="http://schemas.microsoft.com/office/word/2010/wordprocessingGroup" xmlns:wpi="http://schemas.microsoft.com/office/word/2010/wordprocessingInk" xmlns:wne="http://schemas.microsoft.com/office/word/2006/wordml" xmlns:wps="http://schemas.microsoft.com/office/word/2010/wordprocessingShape" mc:Ignorable="w14 w15 w16se w16cid w16 w16cex w16sdtdh w16sdtfl w16du wp14">
   <w:p>
     <w:pPr>
       <w:pStyle w:val="Encabezado"/>
@@ -2039,7 +2100,7 @@
 </file>
 
 <file path=word/header2.xml><?xml version="1.0" encoding="utf-8"?>
-<w:hdr xmlns:wpc="http://schemas.microsoft.com/office/word/2010/wordprocessingCanvas" xmlns:cx="http://schemas.microsoft.com/office/drawing/2014/chartex" xmlns:cx1="http://schemas.microsoft.com/office/drawing/2015/9/8/chartex" xmlns:cx2="http://schemas.microsoft.com/office/drawing/2015/10/21/chartex" xmlns:cx3="http://schemas.microsoft.com/office/drawing/2016/5/9/chartex" xmlns:cx4="http://schemas.microsoft.com/office/drawing/2016/5/10/chartex" xmlns:cx5="http://schemas.microsoft.com/office/drawing/2016/5/11/chartex" xmlns:cx6="http://schemas.microsoft.com/office/drawing/2016/5/12/chartex" xmlns:cx7="http://schemas.microsoft.com/office/drawing/2016/5/13/chartex" xmlns:cx8="http://schemas.microsoft.com/office/drawing/2016/5/14/chartex" xmlns:mc="http://schemas.openxmlformats.org/markup-compatibility/2006" xmlns:aink="http://schemas.microsoft.com/office/drawing/2016/ink" xmlns:am3d="http://schemas.microsoft.com/office/drawing/2017/model3d" xmlns:o="urn:schemas-microsoft-com:office:office" xmlns:oel="http://schemas.microsoft.com/office/2019/extlst" xmlns:r="http://schemas.openxmlformats.org/officeDocument/2006/relationships" xmlns:m="http://schemas.openxmlformats.org/officeDocument/2006/math" xmlns:v="urn:schemas-microsoft-com:vml" xmlns:wp14="http://schemas.microsoft.com/office/word/2010/wordprocessingDrawing" xmlns:wp="http://schemas.openxmlformats.org/drawingml/2006/wordprocessingDrawing" xmlns:w10="urn:schemas-microsoft-com:office:word" xmlns:w="http://schemas.openxmlformats.org/wordprocessingml/2006/main" xmlns:w14="http://schemas.microsoft.com/office/word/2010/wordml" xmlns:w15="http://schemas.microsoft.com/office/word/2012/wordml" xmlns:w16cex="http://schemas.microsoft.com/office/word/2018/wordml/cex" xmlns:w16cid="http://schemas.microsoft.com/office/word/2016/wordml/cid" xmlns:w16="http://schemas.microsoft.com/office/word/2018/wordml" xmlns:w16du="http://schemas.microsoft.com/office/word/2023/wordml/word16du" xmlns:w16sdtdh="http://schemas.microsoft.com/office/word/2020/wordml/sdtdatahash" xmlns:w16sdtfl="http://schemas.microsoft.com/office/word/2024/wordml/sdtformatlock" xmlns:w16se="http://schemas.microsoft.com/office/word/2015/wordml/symex" xmlns:wpg="http://schemas.microsoft.com/office/word/2010/wordprocessingGroup" xmlns:wpi="http://schemas.microsoft.com/office/word/2010/wordprocessingInk" xmlns:wne="http://schemas.microsoft.com/office/word/2006/wordml" xmlns:wps="http://schemas.microsoft.com/office/word/2010/wordprocessingShape" mc:Ignorable="w14 w15 w16se w16cid w16 w16cex w16sdtdh w16sdtfl w16du wp14">
+<w:hdr xmlns:wpc="http://schemas.microsoft.com/office/word/2010/wordprocessingCanvas" xmlns:cx="http://schemas.microsoft.com/office/drawing/2014/chartex" xmlns:cx1="http://schemas.microsoft.com/office/drawing/2015/9/8/chartex" xmlns:cx2="http://schemas.microsoft.com/office/drawing/2015/10/21/chartex" xmlns:cx3="http://schemas.microsoft.com/office/drawing/2016/5/9/chartex" xmlns:cx4="http://schemas.microsoft.com/office/drawing/2016/5/10/chartex" xmlns:cx5="http://schemas.microsoft.com/office/drawing/2016/5/11/chartex" xmlns:cx6="http://schemas.microsoft.com/office/drawing/2016/5/12/chartex" xmlns:cx7="http://schemas.microsoft.com/office/drawing/2016/5/13/chartex" xmlns:cx8="http://schemas.microsoft.com/office/drawing/2016/5/14/chartex" xmlns:mc="http://schemas.openxmlformats.org/markup-compatibility/2006" xmlns:aink="http://schemas.microsoft.com/office/drawing/2016/ink" xmlns:am3d="http://schemas.microsoft.com/office/drawing/2017/model3d" xmlns:o="urn:schemas-microsoft-com:office:office" xmlns:oel="http://schemas.microsoft.com/office/2019/extlst" xmlns:r="http://schemas.openxmlformats.org/officeDocument/2006/relationships" xmlns:m="http://schemas.openxmlformats.org/officeDocument/2006/math" xmlns:v="urn:schemas-microsoft-com:vml" xmlns:wp14="http://schemas.microsoft.com/office/word/2010/wordprocessingDrawing" xmlns:wp="http://schemas.openxmlformats.org/drawingml/2006/wordprocessingDrawing" xmlns:w10="urn:schemas-microsoft-com:office:word" xmlns:w="http://schemas.openxmlformats.org/wordprocessingml/2006/main" xmlns:w14="http://schemas.microsoft.com/office/word/2010/wordml" xmlns:w15="http://schemas.microsoft.com/office/word/2012/wordml" xmlns:w16cei="http://schemas.microsoft.com/office/word/2026/wordml/cei" xmlns:w16cex="http://schemas.microsoft.com/office/word/2018/wordml/cex" xmlns:w16cid="http://schemas.microsoft.com/office/word/2016/wordml/cid" xmlns:w16="http://schemas.microsoft.com/office/word/2018/wordml" xmlns:w16du="http://schemas.microsoft.com/office/word/2023/wordml/word16du" xmlns:w16sdtdh="http://schemas.microsoft.com/office/word/2020/wordml/sdtdatahash" xmlns:w16sdtfl="http://schemas.microsoft.com/office/word/2024/wordml/sdtformatlock" xmlns:w16se="http://schemas.microsoft.com/office/word/2015/wordml/symex" xmlns:wpg="http://schemas.microsoft.com/office/word/2010/wordprocessingGroup" xmlns:wpi="http://schemas.microsoft.com/office/word/2010/wordprocessingInk" xmlns:wne="http://schemas.microsoft.com/office/word/2006/wordml" xmlns:wps="http://schemas.microsoft.com/office/word/2010/wordprocessingShape" mc:Ignorable="w14 w15 w16se w16cid w16 w16cex w16sdtdh w16sdtfl w16du wp14">
   <w:tbl>
     <w:tblPr>
       <w:tblW w:w="3170" w:type="dxa"/>
@@ -2074,6 +2135,7 @@
     </w:pPr>
     <w:r>
       <w:rPr>
+        <w:rFonts w:ascii="Arial" w:hAnsi="Arial" w:cs="Arial"/>
         <w:noProof/>
       </w:rPr>
       <mc:AlternateContent>
@@ -2146,12 +2208,14 @@
                               <w:pPr>
                                 <w:pStyle w:val="Sinespaciado"/>
                                 <w:rPr>
+                                  <w:rFonts w:ascii="Arial" w:hAnsi="Arial" w:cs="Arial"/>
                                   <w:sz w:val="20"/>
                                   <w:szCs w:val="22"/>
                                 </w:rPr>
                               </w:pPr>
                               <w:r>
                                 <w:rPr>
+                                  <w:rFonts w:ascii="Arial" w:hAnsi="Arial" w:cs="Arial"/>
                                   <w:sz w:val="20"/>
                                   <w:szCs w:val="22"/>
                                 </w:rPr>
@@ -2162,12 +2226,14 @@
                               <w:pPr>
                                 <w:pStyle w:val="Sinespaciado"/>
                                 <w:rPr>
+                                  <w:rFonts w:ascii="Arial" w:hAnsi="Arial" w:cs="Arial"/>
                                   <w:sz w:val="20"/>
                                   <w:szCs w:val="22"/>
                                 </w:rPr>
                               </w:pPr>
                               <w:r>
                                 <w:rPr>
+                                  <w:rFonts w:ascii="Arial" w:hAnsi="Arial" w:cs="Arial"/>
                                   <w:sz w:val="20"/>
                                   <w:szCs w:val="22"/>
                                 </w:rPr>
@@ -2175,6 +2241,7 @@
                               </w:r>
                               <w:r>
                                 <w:rPr>
+                                  <w:rFonts w:ascii="Arial" w:hAnsi="Arial" w:cs="Arial"/>
                                   <w:sz w:val="20"/>
                                   <w:szCs w:val="22"/>
                                 </w:rPr>
@@ -2287,12 +2354,14 @@
                         <w:pPr>
                           <w:pStyle w:val="Sinespaciado"/>
                           <w:rPr>
+                            <w:rFonts w:ascii="Arial" w:hAnsi="Arial" w:cs="Arial"/>
                             <w:sz w:val="20"/>
                             <w:szCs w:val="22"/>
                           </w:rPr>
                         </w:pPr>
                         <w:r>
                           <w:rPr>
+                            <w:rFonts w:ascii="Arial" w:hAnsi="Arial" w:cs="Arial"/>
                             <w:sz w:val="20"/>
                             <w:szCs w:val="22"/>
                           </w:rPr>
@@ -2303,12 +2372,14 @@
                         <w:pPr>
                           <w:pStyle w:val="Sinespaciado"/>
                           <w:rPr>
+                            <w:rFonts w:ascii="Arial" w:hAnsi="Arial" w:cs="Arial"/>
                             <w:sz w:val="20"/>
                             <w:szCs w:val="22"/>
                           </w:rPr>
                         </w:pPr>
                         <w:r>
                           <w:rPr>
+                            <w:rFonts w:ascii="Arial" w:hAnsi="Arial" w:cs="Arial"/>
                             <w:sz w:val="20"/>
                             <w:szCs w:val="22"/>
                           </w:rPr>
@@ -2316,6 +2387,7 @@
                         </w:r>
                         <w:r>
                           <w:rPr>
+                            <w:rFonts w:ascii="Arial" w:hAnsi="Arial" w:cs="Arial"/>
                             <w:sz w:val="20"/>
                             <w:szCs w:val="22"/>
                           </w:rPr>
@@ -2361,27 +2433,8 @@
         <w:noProof/>
       </w:rPr>
       <w:pict w14:anchorId="758EA0F0">
-        <v:shapetype id="_x0000_t75" coordsize="21600,21600" o:spt="75" o:preferrelative="t" path="m@4@5l@4@11@9@11@9@5xe" filled="f" stroked="f">
-          <v:stroke joinstyle="miter"/>
-          <v:formulas>
-            <v:f eqn="if lineDrawn pixelLineWidth 0"/>
-            <v:f eqn="sum @0 1 0"/>
-            <v:f eqn="sum 0 0 @1"/>
-            <v:f eqn="prod @2 1 2"/>
-            <v:f eqn="prod @3 21600 pixelWidth"/>
-            <v:f eqn="prod @3 21600 pixelHeight"/>
-            <v:f eqn="sum @0 0 1"/>
-            <v:f eqn="prod @6 1 2"/>
-            <v:f eqn="prod @7 21600 pixelWidth"/>
-            <v:f eqn="sum @8 21600 0"/>
-            <v:f eqn="prod @7 21600 pixelHeight"/>
-            <v:f eqn="sum @10 21600 0"/>
-          </v:formulas>
-          <v:path o:extrusionok="f" gradientshapeok="t" o:connecttype="rect"/>
-          <o:lock v:ext="edit" aspectratio="t"/>
-        </v:shapetype>
         <v:shape id="WordPictureWatermark290952095" o:spid="_x0000_s1034" type="#_x0000_t75" style="position:absolute;margin-left:0;margin-top:0;width:748.8pt;height:499.2pt;z-index:-251643904;mso-position-horizontal:center;mso-position-horizontal-relative:margin;mso-position-vertical:center;mso-position-vertical-relative:margin" o:allowincell="f">
-          <v:imagedata r:id="rId3" o:title="ChatGPT Image 20 abr 2026, 17_21_45" gain="19661f" blacklevel="22938f"/>
+          <v:imagedata r:id="rId2" o:title="ChatGPT Image 20 abr 2026, 17_21_45" gain="19661f" blacklevel="22938f"/>
           <w10:wrap anchorx="margin" anchory="margin"/>
         </v:shape>
       </w:pict>
@@ -2391,7 +2444,7 @@
 </file>
 
 <file path=word/header3.xml><?xml version="1.0" encoding="utf-8"?>
-<w:hdr xmlns:wpc="http://schemas.microsoft.com/office/word/2010/wordprocessingCanvas" xmlns:cx="http://schemas.microsoft.com/office/drawing/2014/chartex" xmlns:cx1="http://schemas.microsoft.com/office/drawing/2015/9/8/chartex" xmlns:cx2="http://schemas.microsoft.com/office/drawing/2015/10/21/chartex" xmlns:cx3="http://schemas.microsoft.com/office/drawing/2016/5/9/chartex" xmlns:cx4="http://schemas.microsoft.com/office/drawing/2016/5/10/chartex" xmlns:cx5="http://schemas.microsoft.com/office/drawing/2016/5/11/chartex" xmlns:cx6="http://schemas.microsoft.com/office/drawing/2016/5/12/chartex" xmlns:cx7="http://schemas.microsoft.com/office/drawing/2016/5/13/chartex" xmlns:cx8="http://schemas.microsoft.com/office/drawing/2016/5/14/chartex" xmlns:mc="http://schemas.openxmlformats.org/markup-compatibility/2006" xmlns:aink="http://schemas.microsoft.com/office/drawing/2016/ink" xmlns:am3d="http://schemas.microsoft.com/office/drawing/2017/model3d" xmlns:o="urn:schemas-microsoft-com:office:office" xmlns:oel="http://schemas.microsoft.com/office/2019/extlst" xmlns:r="http://schemas.openxmlformats.org/officeDocument/2006/relationships" xmlns:m="http://schemas.openxmlformats.org/officeDocument/2006/math" xmlns:v="urn:schemas-microsoft-com:vml" xmlns:wp14="http://schemas.microsoft.com/office/word/2010/wordprocessingDrawing" xmlns:wp="http://schemas.openxmlformats.org/drawingml/2006/wordprocessingDrawing" xmlns:w10="urn:schemas-microsoft-com:office:word" xmlns:w="http://schemas.openxmlformats.org/wordprocessingml/2006/main" xmlns:w14="http://schemas.microsoft.com/office/word/2010/wordml" xmlns:w15="http://schemas.microsoft.com/office/word/2012/wordml" xmlns:w16cex="http://schemas.microsoft.com/office/word/2018/wordml/cex" xmlns:w16cid="http://schemas.microsoft.com/office/word/2016/wordml/cid" xmlns:w16="http://schemas.microsoft.com/office/word/2018/wordml" xmlns:w16du="http://schemas.microsoft.com/office/word/2023/wordml/word16du" xmlns:w16sdtdh="http://schemas.microsoft.com/office/word/2020/wordml/sdtdatahash" xmlns:w16sdtfl="http://schemas.microsoft.com/office/word/2024/wordml/sdtformatlock" xmlns:w16se="http://schemas.microsoft.com/office/word/2015/wordml/symex" xmlns:wpg="http://schemas.microsoft.com/office/word/2010/wordprocessingGroup" xmlns:wpi="http://schemas.microsoft.com/office/word/2010/wordprocessingInk" xmlns:wne="http://schemas.microsoft.com/office/word/2006/wordml" xmlns:wps="http://schemas.microsoft.com/office/word/2010/wordprocessingShape" mc:Ignorable="w14 w15 w16se w16cid w16 w16cex w16sdtdh w16sdtfl w16du wp14">
+<w:hdr xmlns:wpc="http://schemas.microsoft.com/office/word/2010/wordprocessingCanvas" xmlns:cx="http://schemas.microsoft.com/office/drawing/2014/chartex" xmlns:cx1="http://schemas.microsoft.com/office/drawing/2015/9/8/chartex" xmlns:cx2="http://schemas.microsoft.com/office/drawing/2015/10/21/chartex" xmlns:cx3="http://schemas.microsoft.com/office/drawing/2016/5/9/chartex" xmlns:cx4="http://schemas.microsoft.com/office/drawing/2016/5/10/chartex" xmlns:cx5="http://schemas.microsoft.com/office/drawing/2016/5/11/chartex" xmlns:cx6="http://schemas.microsoft.com/office/drawing/2016/5/12/chartex" xmlns:cx7="http://schemas.microsoft.com/office/drawing/2016/5/13/chartex" xmlns:cx8="http://schemas.microsoft.com/office/drawing/2016/5/14/chartex" xmlns:mc="http://schemas.openxmlformats.org/markup-compatibility/2006" xmlns:aink="http://schemas.microsoft.com/office/drawing/2016/ink" xmlns:am3d="http://schemas.microsoft.com/office/drawing/2017/model3d" xmlns:o="urn:schemas-microsoft-com:office:office" xmlns:oel="http://schemas.microsoft.com/office/2019/extlst" xmlns:r="http://schemas.openxmlformats.org/officeDocument/2006/relationships" xmlns:m="http://schemas.openxmlformats.org/officeDocument/2006/math" xmlns:v="urn:schemas-microsoft-com:vml" xmlns:wp14="http://schemas.microsoft.com/office/word/2010/wordprocessingDrawing" xmlns:wp="http://schemas.openxmlformats.org/drawingml/2006/wordprocessingDrawing" xmlns:w10="urn:schemas-microsoft-com:office:word" xmlns:w="http://schemas.openxmlformats.org/wordprocessingml/2006/main" xmlns:w14="http://schemas.microsoft.com/office/word/2010/wordml" xmlns:w15="http://schemas.microsoft.com/office/word/2012/wordml" xmlns:w16cei="http://schemas.microsoft.com/office/word/2026/wordml/cei" xmlns:w16cex="http://schemas.microsoft.com/office/word/2018/wordml/cex" xmlns:w16cid="http://schemas.microsoft.com/office/word/2016/wordml/cid" xmlns:w16="http://schemas.microsoft.com/office/word/2018/wordml" xmlns:w16du="http://schemas.microsoft.com/office/word/2023/wordml/word16du" xmlns:w16sdtdh="http://schemas.microsoft.com/office/word/2020/wordml/sdtdatahash" xmlns:w16sdtfl="http://schemas.microsoft.com/office/word/2024/wordml/sdtformatlock" xmlns:w16se="http://schemas.microsoft.com/office/word/2015/wordml/symex" xmlns:wpg="http://schemas.microsoft.com/office/word/2010/wordprocessingGroup" xmlns:wpi="http://schemas.microsoft.com/office/word/2010/wordprocessingInk" xmlns:wne="http://schemas.microsoft.com/office/word/2006/wordml" xmlns:wps="http://schemas.microsoft.com/office/word/2010/wordprocessingShape" mc:Ignorable="w14 w15 w16se w16cid w16 w16cex w16sdtdh w16sdtfl w16du wp14">
   <w:p>
     <w:pPr>
       <w:pStyle w:val="Encabezado"/>
@@ -2431,7 +2484,7 @@
 </file>
 
 <file path=word/numbering.xml><?xml version="1.0" encoding="utf-8"?>
-<w:numbering xmlns:wpc="http://schemas.microsoft.com/office/word/2010/wordprocessingCanvas" xmlns:cx="http://schemas.microsoft.com/office/drawing/2014/chartex" xmlns:cx1="http://schemas.microsoft.com/office/drawing/2015/9/8/chartex" xmlns:cx2="http://schemas.microsoft.com/office/drawing/2015/10/21/chartex" xmlns:cx3="http://schemas.microsoft.com/office/drawing/2016/5/9/chartex" xmlns:cx4="http://schemas.microsoft.com/office/drawing/2016/5/10/chartex" xmlns:cx5="http://schemas.microsoft.com/office/drawing/2016/5/11/chartex" xmlns:cx6="http://schemas.microsoft.com/office/drawing/2016/5/12/chartex" xmlns:cx7="http://schemas.microsoft.com/office/drawing/2016/5/13/chartex" xmlns:cx8="http://schemas.microsoft.com/office/drawing/2016/5/14/chartex" xmlns:mc="http://schemas.openxmlformats.org/markup-compatibility/2006" xmlns:aink="http://schemas.microsoft.com/office/drawing/2016/ink" xmlns:am3d="http://schemas.microsoft.com/office/drawing/2017/model3d" xmlns:o="urn:schemas-microsoft-com:office:office" xmlns:oel="http://schemas.microsoft.com/office/2019/extlst" xmlns:r="http://schemas.openxmlformats.org/officeDocument/2006/relationships" xmlns:m="http://schemas.openxmlformats.org/officeDocument/2006/math" xmlns:v="urn:schemas-microsoft-com:vml" xmlns:wp14="http://schemas.microsoft.com/office/word/2010/wordprocessingDrawing" xmlns:wp="http://schemas.openxmlformats.org/drawingml/2006/wordprocessingDrawing" xmlns:w10="urn:schemas-microsoft-com:office:word" xmlns:w="http://schemas.openxmlformats.org/wordprocessingml/2006/main" xmlns:w14="http://schemas.microsoft.com/office/word/2010/wordml" xmlns:w15="http://schemas.microsoft.com/office/word/2012/wordml" xmlns:w16cex="http://schemas.microsoft.com/office/word/2018/wordml/cex" xmlns:w16cid="http://schemas.microsoft.com/office/word/2016/wordml/cid" xmlns:w16="http://schemas.microsoft.com/office/word/2018/wordml" xmlns:w16du="http://schemas.microsoft.com/office/word/2023/wordml/word16du" xmlns:w16sdtdh="http://schemas.microsoft.com/office/word/2020/wordml/sdtdatahash" xmlns:w16sdtfl="http://schemas.microsoft.com/office/word/2024/wordml/sdtformatlock" xmlns:w16se="http://schemas.microsoft.com/office/word/2015/wordml/symex" xmlns:wpg="http://schemas.microsoft.com/office/word/2010/wordprocessingGroup" xmlns:wpi="http://schemas.microsoft.com/office/word/2010/wordprocessingInk" xmlns:wne="http://schemas.microsoft.com/office/word/2006/wordml" xmlns:wps="http://schemas.microsoft.com/office/word/2010/wordprocessingShape" mc:Ignorable="w14 w15 w16se w16cid w16 w16cex w16sdtdh w16sdtfl w16du wp14">
+<w:numbering xmlns:wpc="http://schemas.microsoft.com/office/word/2010/wordprocessingCanvas" xmlns:cx="http://schemas.microsoft.com/office/drawing/2014/chartex" xmlns:cx1="http://schemas.microsoft.com/office/drawing/2015/9/8/chartex" xmlns:cx2="http://schemas.microsoft.com/office/drawing/2015/10/21/chartex" xmlns:cx3="http://schemas.microsoft.com/office/drawing/2016/5/9/chartex" xmlns:cx4="http://schemas.microsoft.com/office/drawing/2016/5/10/chartex" xmlns:cx5="http://schemas.microsoft.com/office/drawing/2016/5/11/chartex" xmlns:cx6="http://schemas.microsoft.com/office/drawing/2016/5/12/chartex" xmlns:cx7="http://schemas.microsoft.com/office/drawing/2016/5/13/chartex" xmlns:cx8="http://schemas.microsoft.com/office/drawing/2016/5/14/chartex" xmlns:mc="http://schemas.openxmlformats.org/markup-compatibility/2006" xmlns:aink="http://schemas.microsoft.com/office/drawing/2016/ink" xmlns:am3d="http://schemas.microsoft.com/office/drawing/2017/model3d" xmlns:o="urn:schemas-microsoft-com:office:office" xmlns:oel="http://schemas.microsoft.com/office/2019/extlst" xmlns:r="http://schemas.openxmlformats.org/officeDocument/2006/relationships" xmlns:m="http://schemas.openxmlformats.org/officeDocument/2006/math" xmlns:v="urn:schemas-microsoft-com:vml" xmlns:wp14="http://schemas.microsoft.com/office/word/2010/wordprocessingDrawing" xmlns:wp="http://schemas.openxmlformats.org/drawingml/2006/wordprocessingDrawing" xmlns:w10="urn:schemas-microsoft-com:office:word" xmlns:w="http://schemas.openxmlformats.org/wordprocessingml/2006/main" xmlns:w14="http://schemas.microsoft.com/office/word/2010/wordml" xmlns:w15="http://schemas.microsoft.com/office/word/2012/wordml" xmlns:w16cei="http://schemas.microsoft.com/office/word/2026/wordml/cei" xmlns:w16cex="http://schemas.microsoft.com/office/word/2018/wordml/cex" xmlns:w16cid="http://schemas.microsoft.com/office/word/2016/wordml/cid" xmlns:w16="http://schemas.microsoft.com/office/word/2018/wordml" xmlns:w16du="http://schemas.microsoft.com/office/word/2023/wordml/word16du" xmlns:w16sdtdh="http://schemas.microsoft.com/office/word/2020/wordml/sdtdatahash" xmlns:w16sdtfl="http://schemas.microsoft.com/office/word/2024/wordml/sdtformatlock" xmlns:w16se="http://schemas.microsoft.com/office/word/2015/wordml/symex" xmlns:wpg="http://schemas.microsoft.com/office/word/2010/wordprocessingGroup" xmlns:wpi="http://schemas.microsoft.com/office/word/2010/wordprocessingInk" xmlns:wne="http://schemas.microsoft.com/office/word/2006/wordml" xmlns:wps="http://schemas.microsoft.com/office/word/2010/wordprocessingShape" mc:Ignorable="w14 w15 w16se w16cid w16 w16cex w16sdtdh w16sdtfl w16du wp14">
   <w:numPicBullet w:numPicBulletId="0">
     <w:pict>
       <v:shapetype id="_x0000_t75" coordsize="21600,21600" o:spt="75" o:preferrelative="t" path="m@4@5l@4@11@9@11@9@5xe" filled="f" stroked="f">
@@ -2453,21 +2506,21 @@
         <v:path o:extrusionok="f" gradientshapeok="t" o:connecttype="rect"/>
         <o:lock v:ext="edit" aspectratio="t"/>
       </v:shapetype>
-      <v:shape id="Imagen 5" o:spid="_x0000_i1025" type="#_x0000_t75" alt="Tiktok logo - Icono gratis PNG, SVG" style="width:384.75pt;height:384.75pt;visibility:visible;mso-wrap-style:square" o:bullet="t">
+      <v:shape id="Imagen 5" o:spid="_x0000_i1025" type="#_x0000_t75" alt="Tiktok logo - Icono gratis PNG, SVG" style="width:384.6pt;height:384.6pt;visibility:visible;mso-wrap-style:square" o:bullet="t">
         <v:imagedata r:id="rId1" o:title="Tiktok logo - Icono gratis PNG, SVG"/>
       </v:shape>
     </w:pict>
   </w:numPicBullet>
   <w:numPicBullet w:numPicBulletId="1">
     <w:pict>
-      <v:shape id="Imagen 7" o:spid="_x0000_i1026" type="#_x0000_t75" alt="Icono de Sitio web Generic Flat Gradient | Freepik" style="width:384.4pt;height:384.4pt;flip:x;visibility:visible;mso-wrap-style:square" o:bullet="t">
+      <v:shape id="Imagen 7" o:spid="_x0000_i1026" type="#_x0000_t75" alt="Icono de Sitio web Generic Flat Gradient | Freepik" style="width:384.25pt;height:384.25pt;flip:x;visibility:visible;mso-wrap-style:square" o:bullet="t">
         <v:imagedata r:id="rId2" o:title="Icono de Sitio web Generic Flat Gradient | Freepik"/>
       </v:shape>
     </w:pict>
   </w:numPicBullet>
   <w:numPicBullet w:numPicBulletId="2">
     <w:pict>
-      <v:shape id="Gráfico 3" o:spid="_x0000_i1027" type="#_x0000_t75" alt="Auricular con relleno sólido" style="width:10.65pt;height:9.4pt;visibility:visible" o:gfxdata="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" o:bullet="t">
+      <v:shape id="Gráfico 3" o:spid="_x0000_i1027" type="#_x0000_t75" alt="Auricular con relleno sólido" style="width:10.7pt;height:9.25pt;visibility:visible" o:gfxdata="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" o:bullet="t">
         <v:imagedata r:id="rId3" o:title="" cropbottom="-1024f" cropright="-311f"/>
       </v:shape>
     </w:pict>

</xml_diff>

<commit_message>
Se agrego los modulos para sugerir precios en proveedores y agencias
</commit_message>
<xml_diff>
--- a/backend/routers/plantillas/cobra1.docx
+++ b/backend/routers/plantillas/cobra1.docx
@@ -784,27 +784,6 @@
         </w:rPr>
         <w:t xml:space="preserve">Atentamente; </w:t>
       </w:r>
-    </w:p>
-    <w:p>
-      <w:pPr>
-        <w:pStyle w:val="Sinespaciado"/>
-      </w:pPr>
-    </w:p>
-    <w:p>
-      <w:pPr>
-        <w:spacing w:after="211"/>
-        <w:ind w:left="91"/>
-        <w:rPr>
-          <w:rFonts w:ascii="Arial" w:eastAsia="Arial" w:hAnsi="Arial" w:cs="Arial"/>
-          <w:bCs/>
-          <w:sz w:val="24"/>
-        </w:rPr>
-      </w:pPr>
-    </w:p>
-    <w:p>
-      <w:pPr>
-        <w:spacing w:after="4687"/>
-      </w:pPr>
       <w:r>
         <w:rPr>
           <w:noProof/>
@@ -879,8 +858,10 @@
     <w:sectPr>
       <w:headerReference w:type="even" r:id="rId10"/>
       <w:headerReference w:type="default" r:id="rId11"/>
-      <w:footerReference w:type="default" r:id="rId12"/>
-      <w:headerReference w:type="first" r:id="rId13"/>
+      <w:footerReference w:type="even" r:id="rId12"/>
+      <w:footerReference w:type="default" r:id="rId13"/>
+      <w:headerReference w:type="first" r:id="rId14"/>
+      <w:footerReference w:type="first" r:id="rId15"/>
       <w:pgSz w:w="11906" w:h="16838" w:code="9"/>
       <w:pgMar w:top="851" w:right="851" w:bottom="851" w:left="851" w:header="720" w:footer="720" w:gutter="0"/>
       <w:cols w:space="720"/>
@@ -921,6 +902,16 @@
     <w:pPr>
       <w:pStyle w:val="Piedepgina"/>
     </w:pPr>
+  </w:p>
+</w:ftr>
+</file>
+
+<file path=word/footer2.xml><?xml version="1.0" encoding="utf-8"?>
+<w:ftr xmlns:wpc="http://schemas.microsoft.com/office/word/2010/wordprocessingCanvas" xmlns:cx="http://schemas.microsoft.com/office/drawing/2014/chartex" xmlns:cx1="http://schemas.microsoft.com/office/drawing/2015/9/8/chartex" xmlns:cx2="http://schemas.microsoft.com/office/drawing/2015/10/21/chartex" xmlns:cx3="http://schemas.microsoft.com/office/drawing/2016/5/9/chartex" xmlns:cx4="http://schemas.microsoft.com/office/drawing/2016/5/10/chartex" xmlns:cx5="http://schemas.microsoft.com/office/drawing/2016/5/11/chartex" xmlns:cx6="http://schemas.microsoft.com/office/drawing/2016/5/12/chartex" xmlns:cx7="http://schemas.microsoft.com/office/drawing/2016/5/13/chartex" xmlns:cx8="http://schemas.microsoft.com/office/drawing/2016/5/14/chartex" xmlns:mc="http://schemas.openxmlformats.org/markup-compatibility/2006" xmlns:aink="http://schemas.microsoft.com/office/drawing/2016/ink" xmlns:am3d="http://schemas.microsoft.com/office/drawing/2017/model3d" xmlns:o="urn:schemas-microsoft-com:office:office" xmlns:oel="http://schemas.microsoft.com/office/2019/extlst" xmlns:r="http://schemas.openxmlformats.org/officeDocument/2006/relationships" xmlns:m="http://schemas.openxmlformats.org/officeDocument/2006/math" xmlns:v="urn:schemas-microsoft-com:vml" xmlns:wp14="http://schemas.microsoft.com/office/word/2010/wordprocessingDrawing" xmlns:wp="http://schemas.openxmlformats.org/drawingml/2006/wordprocessingDrawing" xmlns:w10="urn:schemas-microsoft-com:office:word" xmlns:w="http://schemas.openxmlformats.org/wordprocessingml/2006/main" xmlns:w14="http://schemas.microsoft.com/office/word/2010/wordml" xmlns:w15="http://schemas.microsoft.com/office/word/2012/wordml" xmlns:w16cei="http://schemas.microsoft.com/office/word/2026/wordml/cei" xmlns:w16cex="http://schemas.microsoft.com/office/word/2018/wordml/cex" xmlns:w16cid="http://schemas.microsoft.com/office/word/2016/wordml/cid" xmlns:w16="http://schemas.microsoft.com/office/word/2018/wordml" xmlns:w16du="http://schemas.microsoft.com/office/word/2023/wordml/word16du" xmlns:w16sdtdh="http://schemas.microsoft.com/office/word/2020/wordml/sdtdatahash" xmlns:w16sdtfl="http://schemas.microsoft.com/office/word/2024/wordml/sdtformatlock" xmlns:w16se="http://schemas.microsoft.com/office/word/2015/wordml/symex" xmlns:wpg="http://schemas.microsoft.com/office/word/2010/wordprocessingGroup" xmlns:wpi="http://schemas.microsoft.com/office/word/2010/wordprocessingInk" xmlns:wne="http://schemas.microsoft.com/office/word/2006/wordml" xmlns:wps="http://schemas.microsoft.com/office/word/2010/wordprocessingShape" mc:Ignorable="w14 w15 w16se w16cid w16 w16cex w16sdtdh w16sdtfl w16du wp14">
+  <w:p>
+    <w:pPr>
+      <w:pStyle w:val="Piedepgina"/>
+    </w:pPr>
     <w:r>
       <w:rPr>
         <w:rFonts w:ascii="Arial" w:hAnsi="Arial" w:cs="Arial"/>
@@ -929,16 +920,16 @@
       <mc:AlternateContent>
         <mc:Choice Requires="wpg">
           <w:drawing>
-            <wp:anchor distT="0" distB="0" distL="114300" distR="114300" simplePos="0" relativeHeight="251684864" behindDoc="0" locked="0" layoutInCell="1" allowOverlap="1" wp14:anchorId="6F74866F" wp14:editId="1B083219">
+            <wp:anchor distT="0" distB="0" distL="114300" distR="114300" simplePos="0" relativeHeight="251684864" behindDoc="0" locked="0" layoutInCell="1" allowOverlap="1" wp14:anchorId="6F74866F" wp14:editId="5A6C8BE4">
               <wp:simplePos x="0" y="0"/>
               <wp:positionH relativeFrom="margin">
-                <wp:posOffset>267077</wp:posOffset>
+                <wp:align>right</wp:align>
               </wp:positionH>
               <wp:positionV relativeFrom="paragraph">
-                <wp:posOffset>-141517</wp:posOffset>
+                <wp:posOffset>-122863</wp:posOffset>
               </wp:positionV>
-              <wp:extent cx="6508668" cy="751437"/>
-              <wp:effectExtent l="0" t="0" r="26035" b="0"/>
+              <wp:extent cx="6282330" cy="693726"/>
+              <wp:effectExtent l="0" t="0" r="23495" b="11430"/>
               <wp:wrapNone/>
               <wp:docPr id="613892707" name="Grupo 6"/>
               <wp:cNvGraphicFramePr/>
@@ -949,59 +940,20 @@
                     <wpg:grpSpPr>
                       <a:xfrm>
                         <a:off x="0" y="0"/>
-                        <a:ext cx="6508668" cy="751437"/>
-                        <a:chOff x="1319808" y="-12509"/>
-                        <a:chExt cx="4919851" cy="719311"/>
+                        <a:ext cx="6282330" cy="693726"/>
+                        <a:chOff x="1490895" y="-12509"/>
+                        <a:chExt cx="4748764" cy="664068"/>
                       </a:xfrm>
                     </wpg:grpSpPr>
-                    <pic:pic xmlns:pic="http://schemas.openxmlformats.org/drawingml/2006/picture">
-                      <pic:nvPicPr>
-                        <pic:cNvPr id="135544384" name="Imagen 7"/>
-                        <pic:cNvPicPr>
-                          <a:picLocks noChangeAspect="1"/>
-                        </pic:cNvPicPr>
-                      </pic:nvPicPr>
-                      <pic:blipFill rotWithShape="1">
-                        <a:blip r:embed="rId1">
-                          <a:extLst>
-                            <a:ext uri="{28A0092B-C50C-407E-A947-70E740481C1C}">
-                              <a14:useLocalDpi xmlns:a14="http://schemas.microsoft.com/office/drawing/2010/main" val="0"/>
-                            </a:ext>
-                          </a:extLst>
-                        </a:blip>
-                        <a:srcRect l="15152" t="25872" r="13411" b="33049"/>
-                        <a:stretch>
-                          <a:fillRect/>
-                        </a:stretch>
-                      </pic:blipFill>
-                      <pic:spPr bwMode="auto">
-                        <a:xfrm>
-                          <a:off x="1319808" y="39902"/>
-                          <a:ext cx="1331047" cy="666900"/>
-                        </a:xfrm>
-                        <a:prstGeom prst="rect">
-                          <a:avLst/>
-                        </a:prstGeom>
-                        <a:noFill/>
-                        <a:ln>
-                          <a:noFill/>
-                        </a:ln>
-                        <a:extLst>
-                          <a:ext uri="{53640926-AAD7-44D8-BBD7-CCE9431645EC}">
-                            <a14:shadowObscured xmlns:a14="http://schemas.microsoft.com/office/drawing/2010/main"/>
-                          </a:ext>
-                        </a:extLst>
-                      </pic:spPr>
-                    </pic:pic>
                     <wpg:grpSp>
                       <wpg:cNvPr id="837302197" name="Grupo 7"/>
                       <wpg:cNvGrpSpPr/>
                       <wpg:grpSpPr>
                         <a:xfrm>
                           <a:off x="2671960" y="-12509"/>
-                          <a:ext cx="3567699" cy="700781"/>
+                          <a:ext cx="3567699" cy="658494"/>
                           <a:chOff x="1712293" y="-12509"/>
-                          <a:chExt cx="3567699" cy="700781"/>
+                          <a:chExt cx="3567699" cy="658494"/>
                         </a:xfrm>
                       </wpg:grpSpPr>
                       <wpg:grpSp>
@@ -1009,10 +961,10 @@
                         <wpg:cNvGrpSpPr/>
                         <wpg:grpSpPr>
                           <a:xfrm>
-                            <a:off x="1713245" y="-12509"/>
-                            <a:ext cx="3566747" cy="700781"/>
-                            <a:chOff x="1578651" y="-12514"/>
-                            <a:chExt cx="3286549" cy="701075"/>
+                            <a:off x="1726354" y="-12509"/>
+                            <a:ext cx="3553638" cy="658494"/>
+                            <a:chOff x="1590730" y="-12514"/>
+                            <a:chExt cx="3274470" cy="658770"/>
                           </a:xfrm>
                         </wpg:grpSpPr>
                         <wpg:grpSp>
@@ -1020,10 +972,10 @@
                           <wpg:cNvGrpSpPr/>
                           <wpg:grpSpPr>
                             <a:xfrm>
-                              <a:off x="1578651" y="116553"/>
-                              <a:ext cx="1555679" cy="572008"/>
-                              <a:chOff x="1510270" y="104306"/>
-                              <a:chExt cx="1488294" cy="496325"/>
+                              <a:off x="1590730" y="116553"/>
+                              <a:ext cx="1543600" cy="525670"/>
+                              <a:chOff x="1521826" y="104306"/>
+                              <a:chExt cx="1476738" cy="456118"/>
                             </a:xfrm>
                           </wpg:grpSpPr>
                           <wps:wsp>
@@ -1033,8 +985,8 @@
                             </wps:cNvSpPr>
                             <wps:spPr bwMode="auto">
                               <a:xfrm>
-                                <a:off x="1510270" y="174059"/>
-                                <a:ext cx="1453318" cy="426572"/>
+                                <a:off x="1521826" y="133495"/>
+                                <a:ext cx="1468297" cy="426572"/>
                               </a:xfrm>
                               <a:prstGeom prst="rect">
                                 <a:avLst/>
@@ -1084,8 +1036,8 @@
                                         <v:path o:extrusionok="f" gradientshapeok="t" o:connecttype="rect"/>
                                         <o:lock v:ext="edit" aspectratio="t"/>
                                       </v:shapetype>
-                                      <v:shape id="Gráfico 3" o:spid="_x0000_i1029" type="#_x0000_t75" alt="Auricular con relleno sólido" style="width:10.7pt;height:9.25pt;visibility:visible" o:gfxdata="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">
-                                        <v:imagedata r:id="rId2" o:title="" cropbottom="-1024f" cropright="-311f"/>
+                                      <v:shape id="Gráfico 3" o:spid="_x0000_i1029" type="#_x0000_t75" alt="Auricular con relleno sólido" style="width:10.5pt;height:9.5pt;visibility:visible" o:gfxdata="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">
+                                        <v:imagedata r:id="rId1" o:title="" cropbottom="-1024f" cropright="-311f"/>
                                       </v:shape>
                                     </w:pict>
                                   </w:r>
@@ -1116,10 +1068,10 @@
                                                 <pic:cNvPicPr/>
                                               </pic:nvPicPr>
                                               <pic:blipFill>
-                                                <a:blip r:embed="rId3">
+                                                <a:blip r:embed="rId2">
                                                   <a:extLst>
                                                     <a:ext uri="{96DAC541-7B7A-43D3-8B79-37D633B846F1}">
-                                                      <asvg:svgBlip xmlns:asvg="http://schemas.microsoft.com/office/drawing/2016/SVG/main" r:embed="rId4"/>
+                                                      <asvg:svgBlip xmlns:asvg="http://schemas.microsoft.com/office/drawing/2016/SVG/main" r:embed="rId3"/>
                                                     </a:ext>
                                                   </a:extLst>
                                                 </a:blip>
@@ -1189,10 +1141,10 @@
                                                 <pic:cNvPicPr/>
                                               </pic:nvPicPr>
                                               <pic:blipFill>
-                                                <a:blip r:embed="rId3">
+                                                <a:blip r:embed="rId2">
                                                   <a:extLst>
                                                     <a:ext uri="{96DAC541-7B7A-43D3-8B79-37D633B846F1}">
-                                                      <asvg:svgBlip xmlns:asvg="http://schemas.microsoft.com/office/drawing/2016/SVG/main" r:embed="rId4"/>
+                                                      <asvg:svgBlip xmlns:asvg="http://schemas.microsoft.com/office/drawing/2016/SVG/main" r:embed="rId3"/>
                                                     </a:ext>
                                                   </a:extLst>
                                                 </a:blip>
@@ -1331,7 +1283,7 @@
                                       <wp:extent cx="137160" cy="137160"/>
                                       <wp:effectExtent l="0" t="0" r="0" b="0"/>
                                       <wp:docPr id="297324956" name="Imagen 9" descr="Tiktok logo - Icono gratis PNG, SVG">
-                                        <a:hlinkClick xmlns:a="http://schemas.openxmlformats.org/drawingml/2006/main" r:id="rId5"/>
+                                        <a:hlinkClick xmlns:a="http://schemas.openxmlformats.org/drawingml/2006/main" r:id="rId4"/>
                                       </wp:docPr>
                                       <wp:cNvGraphicFramePr>
                                         <a:graphicFrameLocks xmlns:a="http://schemas.openxmlformats.org/drawingml/2006/main" noChangeAspect="1"/>
@@ -1346,7 +1298,7 @@
                                               </pic:cNvPicPr>
                                             </pic:nvPicPr>
                                             <pic:blipFill>
-                                              <a:blip r:embed="rId6">
+                                              <a:blip r:embed="rId5">
                                                 <a:extLst>
                                                   <a:ext uri="{28A0092B-C50C-407E-A947-70E740481C1C}">
                                                     <a14:useLocalDpi xmlns:a14="http://schemas.microsoft.com/office/drawing/2010/main" val="0"/>
@@ -1396,7 +1348,7 @@
                                       <wp:extent cx="172169" cy="187960"/>
                                       <wp:effectExtent l="0" t="0" r="0" b="2540"/>
                                       <wp:docPr id="274922293" name="Imagen 4" descr="Iconos De Facebook PNG para descargar gratis">
-                                        <a:hlinkClick xmlns:a="http://schemas.openxmlformats.org/drawingml/2006/main" r:id="rId7"/>
+                                        <a:hlinkClick xmlns:a="http://schemas.openxmlformats.org/drawingml/2006/main" r:id="rId6"/>
                                       </wp:docPr>
                                       <wp:cNvGraphicFramePr>
                                         <a:graphicFrameLocks xmlns:a="http://schemas.openxmlformats.org/drawingml/2006/main" noChangeAspect="1"/>
@@ -1406,14 +1358,14 @@
                                           <pic:pic xmlns:pic="http://schemas.openxmlformats.org/drawingml/2006/picture">
                                             <pic:nvPicPr>
                                               <pic:cNvPr id="405001739" name="Imagen 4" descr="Iconos De Facebook PNG para descargar gratis">
-                                                <a:hlinkClick r:id="rId7"/>
+                                                <a:hlinkClick r:id="rId6"/>
                                               </pic:cNvPr>
                                               <pic:cNvPicPr>
                                                 <a:picLocks noChangeAspect="1" noChangeArrowheads="1"/>
                                               </pic:cNvPicPr>
                                             </pic:nvPicPr>
                                             <pic:blipFill rotWithShape="1">
-                                              <a:blip r:embed="rId8">
+                                              <a:blip r:embed="rId7">
                                                 <a:extLst>
                                                   <a:ext uri="{28A0092B-C50C-407E-A947-70E740481C1C}">
                                                     <a14:useLocalDpi xmlns:a14="http://schemas.microsoft.com/office/drawing/2010/main" val="0"/>
@@ -1463,7 +1415,7 @@
                                     <w:rFonts w:ascii="Arial" w:hAnsi="Arial" w:cs="Arial"/>
                                   </w:rPr>
                                 </w:pPr>
-                                <w:hyperlink r:id="rId9" w:history="1">
+                                <w:hyperlink r:id="rId8" w:history="1">
                                   <w:r>
                                     <w:rPr>
                                       <w:rStyle w:val="Hipervnculo"/>
@@ -1486,7 +1438,7 @@
                                     <w:rFonts w:ascii="Arial" w:hAnsi="Arial" w:cs="Arial"/>
                                   </w:rPr>
                                 </w:pPr>
-                                <w:hyperlink r:id="rId10" w:history="1">
+                                <w:hyperlink r:id="rId9" w:history="1">
                                   <w:r>
                                     <w:rPr>
                                       <w:rStyle w:val="Hipervnculo"/>
@@ -1568,6 +1520,45 @@
                         <wps:bodyPr/>
                       </wps:wsp>
                     </wpg:grpSp>
+                    <pic:pic xmlns:pic="http://schemas.openxmlformats.org/drawingml/2006/picture">
+                      <pic:nvPicPr>
+                        <pic:cNvPr id="135544384" name="Imagen 7"/>
+                        <pic:cNvPicPr>
+                          <a:picLocks noChangeAspect="1"/>
+                        </pic:cNvPicPr>
+                      </pic:nvPicPr>
+                      <pic:blipFill rotWithShape="1">
+                        <a:blip r:embed="rId10">
+                          <a:extLst>
+                            <a:ext uri="{28A0092B-C50C-407E-A947-70E740481C1C}">
+                              <a14:useLocalDpi xmlns:a14="http://schemas.microsoft.com/office/drawing/2010/main" val="0"/>
+                            </a:ext>
+                          </a:extLst>
+                        </a:blip>
+                        <a:srcRect l="15152" t="25872" r="13411" b="33049"/>
+                        <a:stretch>
+                          <a:fillRect/>
+                        </a:stretch>
+                      </pic:blipFill>
+                      <pic:spPr bwMode="auto">
+                        <a:xfrm>
+                          <a:off x="1490895" y="96218"/>
+                          <a:ext cx="1108638" cy="555341"/>
+                        </a:xfrm>
+                        <a:prstGeom prst="rect">
+                          <a:avLst/>
+                        </a:prstGeom>
+                        <a:noFill/>
+                        <a:ln>
+                          <a:noFill/>
+                        </a:ln>
+                        <a:extLst>
+                          <a:ext uri="{53640926-AAD7-44D8-BBD7-CCE9431645EC}">
+                            <a14:shadowObscured xmlns:a14="http://schemas.microsoft.com/office/drawing/2010/main"/>
+                          </a:ext>
+                        </a:extLst>
+                      </pic:spPr>
+                    </pic:pic>
                   </wpg:wgp>
                 </a:graphicData>
               </a:graphic>
@@ -1582,18 +1573,15 @@
         </mc:Choice>
         <mc:Fallback>
           <w:pict>
-            <v:group w14:anchorId="6F74866F" id="Grupo 6" o:spid="_x0000_s1031" style="position:absolute;margin-left:21.05pt;margin-top:-11.15pt;width:512.5pt;height:59.15pt;z-index:251684864;mso-position-horizontal-relative:margin;mso-width-relative:margin;mso-height-relative:margin" coordorigin="13198,-125" coordsize="49198,7193" o:gfxdata="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">
-              <v:shape id="Imagen 7" o:spid="_x0000_s1032" type="#_x0000_t75" style="position:absolute;left:13198;top:399;width:13310;height:6669;visibility:visible;mso-wrap-style:square" o:gfxdata="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">
-                <v:imagedata r:id="rId11" o:title="" croptop="16955f" cropbottom="21659f" cropleft="9930f" cropright="8789f"/>
-              </v:shape>
-              <v:group id="Grupo 7" o:spid="_x0000_s1033" style="position:absolute;left:26719;top:-125;width:35677;height:7007" coordorigin="17122,-125" coordsize="35676,7007" o:gfxdata="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">
-                <v:group id="_x0000_s1034" style="position:absolute;left:17132;top:-125;width:35667;height:7007" coordorigin="15786,-125" coordsize="32865,7010" o:gfxdata="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">
-                  <v:group id="Grupo 10" o:spid="_x0000_s1035" style="position:absolute;left:15786;top:1165;width:15557;height:5720" coordorigin="15102,1043" coordsize="14882,4963" o:gfxdata="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">
+            <v:group w14:anchorId="6F74866F" id="Grupo 6" o:spid="_x0000_s1031" style="position:absolute;margin-left:443.45pt;margin-top:-9.65pt;width:494.65pt;height:54.6pt;z-index:251684864;mso-position-horizontal:right;mso-position-horizontal-relative:margin;mso-width-relative:margin;mso-height-relative:margin" coordorigin="14908,-125" coordsize="47487,6640" o:gfxdata="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">
+              <v:group id="Grupo 7" o:spid="_x0000_s1032" style="position:absolute;left:26719;top:-125;width:35677;height:6584" coordorigin="17122,-125" coordsize="35676,6584" o:gfxdata="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">
+                <v:group id="_x0000_s1033" style="position:absolute;left:17263;top:-125;width:35536;height:6584" coordorigin="15907,-125" coordsize="32744,6587" o:gfxdata="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">
+                  <v:group id="Grupo 10" o:spid="_x0000_s1034" style="position:absolute;left:15907;top:1165;width:15436;height:5257" coordorigin="15218,1043" coordsize="14767,4561" o:gfxdata="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">
                     <v:shapetype id="_x0000_t202" coordsize="21600,21600" o:spt="202" path="m,l,21600r21600,l21600,xe">
                       <v:stroke joinstyle="miter"/>
                       <v:path gradientshapeok="t" o:connecttype="rect"/>
                     </v:shapetype>
-                    <v:shape id="Cuadro de texto 2" o:spid="_x0000_s1036" type="#_x0000_t202" style="position:absolute;left:15102;top:1740;width:14533;height:4266;visibility:visible;mso-wrap-style:square;v-text-anchor:top" o:gfxdata="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" strokecolor="white [3212]">
+                    <v:shape id="Cuadro de texto 2" o:spid="_x0000_s1035" type="#_x0000_t202" style="position:absolute;left:15218;top:1334;width:14683;height:4266;visibility:visible;mso-wrap-style:square;v-text-anchor:top" o:gfxdata="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" strokecolor="white [3212]">
                       <v:textbox>
                         <w:txbxContent>
                           <w:p>
@@ -1608,8 +1596,8 @@
                                 <w:rFonts w:ascii="Arial" w:hAnsi="Arial" w:cs="Arial"/>
                               </w:rPr>
                               <w:pict w14:anchorId="6F850E0E">
-                                <v:shape id="Gráfico 3" o:spid="_x0000_i1029" type="#_x0000_t75" alt="Auricular con relleno sólido" style="width:10.7pt;height:9.25pt;visibility:visible" o:gfxdata="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">
-                                  <v:imagedata r:id="rId2" o:title="" cropbottom="-1024f" cropright="-311f"/>
+                                <v:shape id="Gráfico 3" o:spid="_x0000_i1029" type="#_x0000_t75" alt="Auricular con relleno sólido" style="width:10.5pt;height:9.5pt;visibility:visible" o:gfxdata="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">
+                                  <v:imagedata r:id="rId1" o:title="" cropbottom="-1024f" cropright="-311f"/>
                                 </v:shape>
                               </w:pict>
                             </w:r>
@@ -1640,10 +1628,10 @@
                                           <pic:cNvPicPr/>
                                         </pic:nvPicPr>
                                         <pic:blipFill>
-                                          <a:blip r:embed="rId3">
+                                          <a:blip r:embed="rId2">
                                             <a:extLst>
                                               <a:ext uri="{96DAC541-7B7A-43D3-8B79-37D633B846F1}">
-                                                <asvg:svgBlip xmlns:asvg="http://schemas.microsoft.com/office/drawing/2016/SVG/main" r:embed="rId4"/>
+                                                <asvg:svgBlip xmlns:asvg="http://schemas.microsoft.com/office/drawing/2016/SVG/main" r:embed="rId3"/>
                                               </a:ext>
                                             </a:extLst>
                                           </a:blip>
@@ -1713,10 +1701,10 @@
                                           <pic:cNvPicPr/>
                                         </pic:nvPicPr>
                                         <pic:blipFill>
-                                          <a:blip r:embed="rId3">
+                                          <a:blip r:embed="rId2">
                                             <a:extLst>
                                               <a:ext uri="{96DAC541-7B7A-43D3-8B79-37D633B846F1}">
-                                                <asvg:svgBlip xmlns:asvg="http://schemas.microsoft.com/office/drawing/2016/SVG/main" r:embed="rId4"/>
+                                                <asvg:svgBlip xmlns:asvg="http://schemas.microsoft.com/office/drawing/2016/SVG/main" r:embed="rId3"/>
                                               </a:ext>
                                             </a:extLst>
                                           </a:blip>
@@ -1768,11 +1756,11 @@
                         </w:txbxContent>
                       </v:textbox>
                     </v:shape>
-                    <v:line id="Conector recto 1" o:spid="_x0000_s1037" style="position:absolute;visibility:visible;mso-wrap-style:square" from="29985,1043" to="29985,5604" o:connectortype="straight" o:gfxdata="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" strokecolor="black [3213]" strokeweight="1pt">
+                    <v:line id="Conector recto 1" o:spid="_x0000_s1036" style="position:absolute;visibility:visible;mso-wrap-style:square" from="29985,1043" to="29985,5604" o:connectortype="straight" o:gfxdata="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" strokecolor="black [3213]" strokeweight="1pt">
                       <v:stroke joinstyle="miter"/>
                     </v:line>
                   </v:group>
-                  <v:shape id="Cuadro de texto 2" o:spid="_x0000_s1038" type="#_x0000_t202" style="position:absolute;left:31379;top:-125;width:17273;height:6587;visibility:visible;mso-wrap-style:square;v-text-anchor:top" o:gfxdata="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" strokecolor="white [3212]">
+                  <v:shape id="Cuadro de texto 2" o:spid="_x0000_s1037" type="#_x0000_t202" style="position:absolute;left:31379;top:-125;width:17273;height:6587;visibility:visible;mso-wrap-style:square;v-text-anchor:top" o:gfxdata="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" strokecolor="white [3212]">
                     <v:textbox>
                       <w:txbxContent>
                         <w:p>
@@ -1798,7 +1786,7 @@
                                 <wp:extent cx="137160" cy="137160"/>
                                 <wp:effectExtent l="0" t="0" r="0" b="0"/>
                                 <wp:docPr id="297324956" name="Imagen 9" descr="Tiktok logo - Icono gratis PNG, SVG">
-                                  <a:hlinkClick xmlns:a="http://schemas.openxmlformats.org/drawingml/2006/main" r:id="rId5"/>
+                                  <a:hlinkClick xmlns:a="http://schemas.openxmlformats.org/drawingml/2006/main" r:id="rId4"/>
                                 </wp:docPr>
                                 <wp:cNvGraphicFramePr>
                                   <a:graphicFrameLocks xmlns:a="http://schemas.openxmlformats.org/drawingml/2006/main" noChangeAspect="1"/>
@@ -1813,7 +1801,7 @@
                                         </pic:cNvPicPr>
                                       </pic:nvPicPr>
                                       <pic:blipFill>
-                                        <a:blip r:embed="rId6">
+                                        <a:blip r:embed="rId5">
                                           <a:extLst>
                                             <a:ext uri="{28A0092B-C50C-407E-A947-70E740481C1C}">
                                               <a14:useLocalDpi xmlns:a14="http://schemas.microsoft.com/office/drawing/2010/main" val="0"/>
@@ -1863,7 +1851,7 @@
                                 <wp:extent cx="172169" cy="187960"/>
                                 <wp:effectExtent l="0" t="0" r="0" b="2540"/>
                                 <wp:docPr id="274922293" name="Imagen 4" descr="Iconos De Facebook PNG para descargar gratis">
-                                  <a:hlinkClick xmlns:a="http://schemas.openxmlformats.org/drawingml/2006/main" r:id="rId7"/>
+                                  <a:hlinkClick xmlns:a="http://schemas.openxmlformats.org/drawingml/2006/main" r:id="rId6"/>
                                 </wp:docPr>
                                 <wp:cNvGraphicFramePr>
                                   <a:graphicFrameLocks xmlns:a="http://schemas.openxmlformats.org/drawingml/2006/main" noChangeAspect="1"/>
@@ -1873,14 +1861,14 @@
                                     <pic:pic xmlns:pic="http://schemas.openxmlformats.org/drawingml/2006/picture">
                                       <pic:nvPicPr>
                                         <pic:cNvPr id="405001739" name="Imagen 4" descr="Iconos De Facebook PNG para descargar gratis">
-                                          <a:hlinkClick r:id="rId7"/>
+                                          <a:hlinkClick r:id="rId6"/>
                                         </pic:cNvPr>
                                         <pic:cNvPicPr>
                                           <a:picLocks noChangeAspect="1" noChangeArrowheads="1"/>
                                         </pic:cNvPicPr>
                                       </pic:nvPicPr>
                                       <pic:blipFill rotWithShape="1">
-                                        <a:blip r:embed="rId8">
+                                        <a:blip r:embed="rId7">
                                           <a:extLst>
                                             <a:ext uri="{28A0092B-C50C-407E-A947-70E740481C1C}">
                                               <a14:useLocalDpi xmlns:a14="http://schemas.microsoft.com/office/drawing/2010/main" val="0"/>
@@ -1930,7 +1918,7 @@
                               <w:rFonts w:ascii="Arial" w:hAnsi="Arial" w:cs="Arial"/>
                             </w:rPr>
                           </w:pPr>
-                          <w:hyperlink r:id="rId12" w:history="1">
+                          <w:hyperlink r:id="rId11" w:history="1">
                             <w:r>
                               <w:rPr>
                                 <w:rStyle w:val="Hipervnculo"/>
@@ -1953,7 +1941,7 @@
                               <w:rFonts w:ascii="Arial" w:hAnsi="Arial" w:cs="Arial"/>
                             </w:rPr>
                           </w:pPr>
-                          <w:hyperlink r:id="rId13" w:history="1">
+                          <w:hyperlink r:id="rId12" w:history="1">
                             <w:r>
                               <w:rPr>
                                 <w:rStyle w:val="Hipervnculo"/>
@@ -1998,16 +1986,29 @@
                     </v:textbox>
                   </v:shape>
                 </v:group>
-                <v:line id="Conector recto 1" o:spid="_x0000_s1039" style="position:absolute;visibility:visible;mso-wrap-style:square" from="17122,1165" to="17122,6416" o:connectortype="straight" o:gfxdata="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" strokecolor="black [3213]" strokeweight="1pt">
+                <v:line id="Conector recto 1" o:spid="_x0000_s1038" style="position:absolute;visibility:visible;mso-wrap-style:square" from="17122,1165" to="17122,6416" o:connectortype="straight" o:gfxdata="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" strokecolor="black [3213]" strokeweight="1pt">
                   <v:stroke joinstyle="miter"/>
                 </v:line>
               </v:group>
+              <v:shape id="Imagen 7" o:spid="_x0000_s1039" type="#_x0000_t75" style="position:absolute;left:14908;top:962;width:11087;height:5553;visibility:visible;mso-wrap-style:square" o:gfxdata="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">
+                <v:imagedata r:id="rId13" o:title="" croptop="16955f" cropbottom="21659f" cropleft="9930f" cropright="8789f"/>
+              </v:shape>
               <w10:wrap anchorx="margin"/>
             </v:group>
           </w:pict>
         </mc:Fallback>
       </mc:AlternateContent>
     </w:r>
+  </w:p>
+</w:ftr>
+</file>
+
+<file path=word/footer3.xml><?xml version="1.0" encoding="utf-8"?>
+<w:ftr xmlns:wpc="http://schemas.microsoft.com/office/word/2010/wordprocessingCanvas" xmlns:cx="http://schemas.microsoft.com/office/drawing/2014/chartex" xmlns:cx1="http://schemas.microsoft.com/office/drawing/2015/9/8/chartex" xmlns:cx2="http://schemas.microsoft.com/office/drawing/2015/10/21/chartex" xmlns:cx3="http://schemas.microsoft.com/office/drawing/2016/5/9/chartex" xmlns:cx4="http://schemas.microsoft.com/office/drawing/2016/5/10/chartex" xmlns:cx5="http://schemas.microsoft.com/office/drawing/2016/5/11/chartex" xmlns:cx6="http://schemas.microsoft.com/office/drawing/2016/5/12/chartex" xmlns:cx7="http://schemas.microsoft.com/office/drawing/2016/5/13/chartex" xmlns:cx8="http://schemas.microsoft.com/office/drawing/2016/5/14/chartex" xmlns:mc="http://schemas.openxmlformats.org/markup-compatibility/2006" xmlns:aink="http://schemas.microsoft.com/office/drawing/2016/ink" xmlns:am3d="http://schemas.microsoft.com/office/drawing/2017/model3d" xmlns:o="urn:schemas-microsoft-com:office:office" xmlns:oel="http://schemas.microsoft.com/office/2019/extlst" xmlns:r="http://schemas.openxmlformats.org/officeDocument/2006/relationships" xmlns:m="http://schemas.openxmlformats.org/officeDocument/2006/math" xmlns:v="urn:schemas-microsoft-com:vml" xmlns:wp14="http://schemas.microsoft.com/office/word/2010/wordprocessingDrawing" xmlns:wp="http://schemas.openxmlformats.org/drawingml/2006/wordprocessingDrawing" xmlns:w10="urn:schemas-microsoft-com:office:word" xmlns:w="http://schemas.openxmlformats.org/wordprocessingml/2006/main" xmlns:w14="http://schemas.microsoft.com/office/word/2010/wordml" xmlns:w15="http://schemas.microsoft.com/office/word/2012/wordml" xmlns:w16cei="http://schemas.microsoft.com/office/word/2026/wordml/cei" xmlns:w16cex="http://schemas.microsoft.com/office/word/2018/wordml/cex" xmlns:w16cid="http://schemas.microsoft.com/office/word/2016/wordml/cid" xmlns:w16="http://schemas.microsoft.com/office/word/2018/wordml" xmlns:w16du="http://schemas.microsoft.com/office/word/2023/wordml/word16du" xmlns:w16sdtdh="http://schemas.microsoft.com/office/word/2020/wordml/sdtdatahash" xmlns:w16sdtfl="http://schemas.microsoft.com/office/word/2024/wordml/sdtformatlock" xmlns:w16se="http://schemas.microsoft.com/office/word/2015/wordml/symex" xmlns:wpg="http://schemas.microsoft.com/office/word/2010/wordprocessingGroup" xmlns:wpi="http://schemas.microsoft.com/office/word/2010/wordprocessingInk" xmlns:wne="http://schemas.microsoft.com/office/word/2006/wordml" xmlns:wps="http://schemas.microsoft.com/office/word/2010/wordprocessingShape" mc:Ignorable="w14 w15 w16se w16cid w16 w16cex w16sdtdh w16sdtfl w16du wp14">
+  <w:p>
+    <w:pPr>
+      <w:pStyle w:val="Piedepgina"/>
+    </w:pPr>
   </w:p>
 </w:ftr>
 </file>
@@ -2067,7 +2068,7 @@
           <v:path o:extrusionok="f" gradientshapeok="t" o:connecttype="rect"/>
           <o:lock v:ext="edit" aspectratio="t"/>
         </v:shapetype>
-        <v:shape id="WordPictureWatermark290952094" o:spid="_x0000_s1033" type="#_x0000_t75" style="position:absolute;margin-left:0;margin-top:0;width:748.8pt;height:499.2pt;z-index:-251644928;mso-position-horizontal:center;mso-position-horizontal-relative:margin;mso-position-vertical:center;mso-position-vertical-relative:margin" o:allowincell="f">
+        <v:shape id="WordPictureWatermark496302751" o:spid="_x0000_s1033" type="#_x0000_t75" style="position:absolute;margin-left:0;margin-top:0;width:748.8pt;height:499.2pt;z-index:-251644928;mso-position-horizontal:center;mso-position-horizontal-relative:margin;mso-position-vertical:center;mso-position-vertical-relative:margin" o:allowincell="f">
           <v:imagedata r:id="rId1" o:title="ChatGPT Image 20 abr 2026, 17_21_45" gain="19661f" blacklevel="22938f"/>
           <w10:wrap anchorx="margin" anchory="margin"/>
         </v:shape>
@@ -2135,7 +2136,7 @@
           <v:path o:extrusionok="f" gradientshapeok="t" o:connecttype="rect"/>
           <o:lock v:ext="edit" aspectratio="t"/>
         </v:shapetype>
-        <v:shape id="WordPictureWatermark290952095" o:spid="_x0000_s1034" type="#_x0000_t75" style="position:absolute;margin-left:0;margin-top:0;width:748.8pt;height:868.1pt;z-index:-251643904;mso-position-horizontal:center;mso-position-horizontal-relative:margin;mso-position-vertical:center;mso-position-vertical-relative:margin" o:allowincell="f">
+        <v:shape id="WordPictureWatermark496302752" o:spid="_x0000_s1034" type="#_x0000_t75" style="position:absolute;margin-left:0;margin-top:0;width:748.8pt;height:499.2pt;z-index:-251643904;mso-position-horizontal:center;mso-position-horizontal-relative:margin;mso-position-vertical:center;mso-position-vertical-relative:margin" o:allowincell="f" stroked="t" strokecolor="white [3212]">
           <v:imagedata r:id="rId1" o:title="ChatGPT Image 20 abr 2026, 17_21_45" gain="19661f" blacklevel="22938f"/>
           <w10:wrap anchorx="margin" anchory="margin"/>
         </v:shape>
@@ -2410,7 +2411,7 @@
                 </v:line>
               </v:group>
               <v:shape id="Imagen 7" o:spid="_x0000_s1030" type="#_x0000_t75" style="position:absolute;left:-4493;top:-1257;width:19721;height:7530;visibility:visible;mso-wrap-style:square" o:gfxdata="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">
-                <v:imagedata r:id="rId1" o:title="" croptop="16955f" cropbottom="21659f" cropleft="9930f" cropright="8789f"/>
+                <v:imagedata r:id="rId3" o:title="" croptop="16955f" cropbottom="21659f" cropleft="9930f" cropright="8789f"/>
               </v:shape>
             </v:group>
           </w:pict>
@@ -2451,7 +2452,7 @@
           <v:path o:extrusionok="f" gradientshapeok="t" o:connecttype="rect"/>
           <o:lock v:ext="edit" aspectratio="t"/>
         </v:shapetype>
-        <v:shape id="WordPictureWatermark290952093" o:spid="_x0000_s1032" type="#_x0000_t75" style="position:absolute;margin-left:0;margin-top:0;width:748.8pt;height:499.2pt;z-index:-251645952;mso-position-horizontal:center;mso-position-horizontal-relative:margin;mso-position-vertical:center;mso-position-vertical-relative:margin" o:allowincell="f">
+        <v:shape id="WordPictureWatermark496302750" o:spid="_x0000_s1032" type="#_x0000_t75" style="position:absolute;margin-left:0;margin-top:0;width:748.8pt;height:499.2pt;z-index:-251645952;mso-position-horizontal:center;mso-position-horizontal-relative:margin;mso-position-vertical:center;mso-position-vertical-relative:margin" o:allowincell="f">
           <v:imagedata r:id="rId1" o:title="ChatGPT Image 20 abr 2026, 17_21_45" gain="19661f" blacklevel="22938f"/>
           <w10:wrap anchorx="margin" anchory="margin"/>
         </v:shape>
@@ -2484,21 +2485,21 @@
         <v:path o:extrusionok="f" gradientshapeok="t" o:connecttype="rect"/>
         <o:lock v:ext="edit" aspectratio="t"/>
       </v:shapetype>
-      <v:shape id="Imagen 5" o:spid="_x0000_i1025" type="#_x0000_t75" alt="Tiktok logo - Icono gratis PNG, SVG" style="width:384.6pt;height:384.6pt;visibility:visible;mso-wrap-style:square" o:bullet="t">
+      <v:shape id="Imagen 5" o:spid="_x0000_i1025" type="#_x0000_t75" alt="Tiktok logo - Icono gratis PNG, SVG" style="width:385pt;height:385pt;visibility:visible;mso-wrap-style:square" o:bullet="t">
         <v:imagedata r:id="rId1" o:title="Tiktok logo - Icono gratis PNG, SVG"/>
       </v:shape>
     </w:pict>
   </w:numPicBullet>
   <w:numPicBullet w:numPicBulletId="1">
     <w:pict>
-      <v:shape id="Imagen 7" o:spid="_x0000_i1026" type="#_x0000_t75" alt="Icono de Sitio web Generic Flat Gradient | Freepik" style="width:384.25pt;height:384.25pt;flip:x;visibility:visible;mso-wrap-style:square" o:bullet="t">
+      <v:shape id="Imagen 7" o:spid="_x0000_i1026" type="#_x0000_t75" alt="Icono de Sitio web Generic Flat Gradient | Freepik" style="width:384.5pt;height:384.5pt;flip:x;visibility:visible;mso-wrap-style:square" o:bullet="t">
         <v:imagedata r:id="rId2" o:title="Icono de Sitio web Generic Flat Gradient | Freepik"/>
       </v:shape>
     </w:pict>
   </w:numPicBullet>
   <w:numPicBullet w:numPicBulletId="2">
     <w:pict>
-      <v:shape id="Gráfico 3" o:spid="_x0000_i1027" type="#_x0000_t75" alt="Auricular con relleno sólido" style="width:10.7pt;height:9.25pt;visibility:visible" o:gfxdata="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" o:bullet="t">
+      <v:shape id="Gráfico 3" o:spid="_x0000_i1027" type="#_x0000_t75" alt="Auricular con relleno sólido" style="width:10.5pt;height:9.5pt;visibility:visible" o:gfxdata="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" o:bullet="t">
         <v:imagedata r:id="rId3" o:title="" cropbottom="-1024f" cropright="-311f"/>
       </v:shape>
     </w:pict>

</xml_diff>